<commit_message>
Cập nhật font chữ bị lỗi
</commit_message>
<xml_diff>
--- a/25410295/25410295_rubik1.docx
+++ b/25410295/25410295_rubik1.docx
@@ -109,7 +109,7 @@
           <wp:inline distB="0" distT="0" distL="0" distR="0">
             <wp:extent cx="1711974" cy="1156956"/>
             <wp:effectExtent b="0" l="0" r="0" t="0"/>
-            <wp:docPr descr="A blue logo with a planet and a flower&#10;&#10;AI-generated content may be incorrect." id="2" name="image1.png"/>
+            <wp:docPr descr="A blue logo with a planet and a flower&#10;&#10;AI-generated content may be incorrect." id="1" name="image1.png"/>
             <a:graphic>
               <a:graphicData uri="http://schemas.openxmlformats.org/drawingml/2006/picture">
                 <pic:pic>
@@ -151,17 +151,17 @@
           <w:rFonts w:ascii="Times New Roman" w:cs="Times New Roman" w:eastAsia="Times New Roman" w:hAnsi="Times New Roman"/>
           <w:b w:val="1"/>
           <w:bCs w:val="1"/>
-          <w:sz w:val="36"/>
-          <w:szCs w:val="36"/>
-        </w:rPr>
-      </w:pPr>
-      <w:r>
-        <w:rPr>
-          <w:rFonts w:ascii="Times New Roman" w:cs="Times New Roman" w:eastAsia="Times New Roman" w:hAnsi="Times New Roman"/>
-          <w:b w:val="1"/>
-          <w:bCs w:val="1"/>
-          <w:sz w:val="36"/>
-          <w:szCs w:val="36"/>
+          <w:sz w:val="32"/>
+          <w:szCs w:val="32"/>
+        </w:rPr>
+      </w:pPr>
+      <w:r>
+        <w:rPr>
+          <w:rFonts w:ascii="Times New Roman" w:cs="Times New Roman" w:eastAsia="Times New Roman" w:hAnsi="Times New Roman"/>
+          <w:b w:val="1"/>
+          <w:bCs w:val="1"/>
+          <w:sz w:val="32"/>
+          <w:szCs w:val="32"/>
           <w:rtl w:val="0"/>
         </w:rPr>
         <w:t xml:space="preserve">BÁO CÁO ĐỒ ÁN CUỐI KỲ</w:t>
@@ -174,15 +174,15 @@
           <w:rFonts w:ascii="Times New Roman" w:cs="Times New Roman" w:eastAsia="Times New Roman" w:hAnsi="Times New Roman"/>
           <w:b w:val="1"/>
           <w:bCs w:val="1"/>
-          <w:sz w:val="36"/>
-          <w:szCs w:val="36"/>
-        </w:rPr>
-      </w:pPr>
-      <w:r>
-        <w:rPr>
-          <w:rFonts w:ascii="Times New Roman" w:cs="Times New Roman" w:eastAsia="Times New Roman" w:hAnsi="Times New Roman"/>
-          <w:sz w:val="36"/>
-          <w:szCs w:val="36"/>
+          <w:sz w:val="32"/>
+          <w:szCs w:val="32"/>
+        </w:rPr>
+      </w:pPr>
+      <w:r>
+        <w:rPr>
+          <w:rFonts w:ascii="Times New Roman" w:cs="Times New Roman" w:eastAsia="Times New Roman" w:hAnsi="Times New Roman"/>
+          <w:sz w:val="32"/>
+          <w:szCs w:val="32"/>
           <w:rtl w:val="0"/>
         </w:rPr>
         <w:t xml:space="preserve"> </w:t>
@@ -192,8 +192,8 @@
           <w:rFonts w:ascii="Times New Roman" w:cs="Times New Roman" w:eastAsia="Times New Roman" w:hAnsi="Times New Roman"/>
           <w:b w:val="1"/>
           <w:bCs w:val="1"/>
-          <w:sz w:val="36"/>
-          <w:szCs w:val="36"/>
+          <w:sz w:val="32"/>
+          <w:szCs w:val="32"/>
           <w:rtl w:val="0"/>
         </w:rPr>
         <w:t xml:space="preserve">HỆ THỐNG QUẢN TRỊ QUY TRÌNH NGHIỆP VỤ</w:t>
@@ -206,8 +206,8 @@
           <w:rFonts w:ascii="Times New Roman" w:cs="Times New Roman" w:eastAsia="Times New Roman" w:hAnsi="Times New Roman"/>
           <w:b w:val="1"/>
           <w:bCs w:val="1"/>
-          <w:sz w:val="36"/>
-          <w:szCs w:val="36"/>
+          <w:sz w:val="32"/>
+          <w:szCs w:val="32"/>
           <w:u w:val="single"/>
         </w:rPr>
       </w:pPr>
@@ -216,8 +216,8 @@
           <w:rFonts w:ascii="Times New Roman" w:cs="Times New Roman" w:eastAsia="Times New Roman" w:hAnsi="Times New Roman"/>
           <w:b w:val="1"/>
           <w:bCs w:val="1"/>
-          <w:sz w:val="36"/>
-          <w:szCs w:val="36"/>
+          <w:sz w:val="32"/>
+          <w:szCs w:val="32"/>
           <w:u w:val="single"/>
           <w:rtl w:val="0"/>
         </w:rPr>
@@ -230,15 +230,15 @@
         <w:jc w:val="center"/>
         <w:rPr>
           <w:rFonts w:ascii="Times New Roman" w:cs="Times New Roman" w:eastAsia="Times New Roman" w:hAnsi="Times New Roman"/>
-          <w:sz w:val="36"/>
-          <w:szCs w:val="36"/>
-        </w:rPr>
-      </w:pPr>
-      <w:r>
-        <w:rPr>
-          <w:rFonts w:ascii="Times New Roman" w:cs="Times New Roman" w:eastAsia="Times New Roman" w:hAnsi="Times New Roman"/>
-          <w:sz w:val="36"/>
-          <w:szCs w:val="36"/>
+          <w:sz w:val="32"/>
+          <w:szCs w:val="32"/>
+        </w:rPr>
+      </w:pPr>
+      <w:r>
+        <w:rPr>
+          <w:rFonts w:ascii="Times New Roman" w:cs="Times New Roman" w:eastAsia="Times New Roman" w:hAnsi="Times New Roman"/>
+          <w:sz w:val="32"/>
+          <w:szCs w:val="32"/>
           <w:rtl w:val="0"/>
         </w:rPr>
         <w:t xml:space="preserve">Hệ thống quản trị quy trình nghiệp vụ</w:t>
@@ -250,15 +250,15 @@
         <w:jc w:val="center"/>
         <w:rPr>
           <w:rFonts w:ascii="Times New Roman" w:cs="Times New Roman" w:eastAsia="Times New Roman" w:hAnsi="Times New Roman"/>
-          <w:sz w:val="36"/>
-          <w:szCs w:val="36"/>
-        </w:rPr>
-      </w:pPr>
-      <w:r>
-        <w:rPr>
-          <w:rFonts w:ascii="Times New Roman" w:cs="Times New Roman" w:eastAsia="Times New Roman" w:hAnsi="Times New Roman"/>
-          <w:sz w:val="36"/>
-          <w:szCs w:val="36"/>
+          <w:sz w:val="32"/>
+          <w:szCs w:val="32"/>
+        </w:rPr>
+      </w:pPr>
+      <w:r>
+        <w:rPr>
+          <w:rFonts w:ascii="Times New Roman" w:cs="Times New Roman" w:eastAsia="Times New Roman" w:hAnsi="Times New Roman"/>
+          <w:sz w:val="32"/>
+          <w:szCs w:val="32"/>
           <w:rtl w:val="0"/>
         </w:rPr>
         <w:t xml:space="preserve">tại Hệ thống nhà thuốc FPT Long Châu</w:t>
@@ -270,50 +270,50 @@
         <w:jc w:val="center"/>
         <w:rPr>
           <w:rFonts w:ascii="Times New Roman" w:cs="Times New Roman" w:eastAsia="Times New Roman" w:hAnsi="Times New Roman"/>
-          <w:sz w:val="36"/>
-          <w:szCs w:val="36"/>
-        </w:rPr>
-      </w:pPr>
-      <w:r>
-        <w:rPr>
-          <w:rtl w:val="0"/>
-        </w:rPr>
-      </w:r>
-    </w:p>
-    <w:p>
-      <w:pPr>
-        <w:spacing w:after="0" w:lineRule="auto"/>
-        <w:jc w:val="center"/>
-        <w:rPr>
-          <w:rFonts w:ascii="Times New Roman" w:cs="Times New Roman" w:eastAsia="Times New Roman" w:hAnsi="Times New Roman"/>
-          <w:sz w:val="36"/>
-          <w:szCs w:val="36"/>
-        </w:rPr>
-      </w:pPr>
-      <w:r>
-        <w:rPr>
-          <w:rtl w:val="0"/>
-        </w:rPr>
-      </w:r>
-    </w:p>
-    <w:p>
-      <w:pPr>
-        <w:jc w:val="center"/>
-        <w:rPr>
-          <w:rFonts w:ascii="Times New Roman" w:cs="Times New Roman" w:eastAsia="Times New Roman" w:hAnsi="Times New Roman"/>
-          <w:b w:val="1"/>
-          <w:bCs w:val="1"/>
-          <w:sz w:val="36"/>
-          <w:szCs w:val="36"/>
-        </w:rPr>
-      </w:pPr>
-      <w:r>
-        <w:rPr>
-          <w:rFonts w:ascii="Times New Roman" w:cs="Times New Roman" w:eastAsia="Times New Roman" w:hAnsi="Times New Roman"/>
-          <w:b w:val="1"/>
-          <w:bCs w:val="1"/>
-          <w:sz w:val="36"/>
-          <w:szCs w:val="36"/>
+          <w:sz w:val="32"/>
+          <w:szCs w:val="32"/>
+        </w:rPr>
+      </w:pPr>
+      <w:r>
+        <w:rPr>
+          <w:rtl w:val="0"/>
+        </w:rPr>
+      </w:r>
+    </w:p>
+    <w:p>
+      <w:pPr>
+        <w:spacing w:after="0" w:lineRule="auto"/>
+        <w:jc w:val="center"/>
+        <w:rPr>
+          <w:rFonts w:ascii="Times New Roman" w:cs="Times New Roman" w:eastAsia="Times New Roman" w:hAnsi="Times New Roman"/>
+          <w:sz w:val="32"/>
+          <w:szCs w:val="32"/>
+        </w:rPr>
+      </w:pPr>
+      <w:r>
+        <w:rPr>
+          <w:rtl w:val="0"/>
+        </w:rPr>
+      </w:r>
+    </w:p>
+    <w:p>
+      <w:pPr>
+        <w:jc w:val="center"/>
+        <w:rPr>
+          <w:rFonts w:ascii="Times New Roman" w:cs="Times New Roman" w:eastAsia="Times New Roman" w:hAnsi="Times New Roman"/>
+          <w:b w:val="1"/>
+          <w:bCs w:val="1"/>
+          <w:sz w:val="32"/>
+          <w:szCs w:val="32"/>
+        </w:rPr>
+      </w:pPr>
+      <w:r>
+        <w:rPr>
+          <w:rFonts w:ascii="Times New Roman" w:cs="Times New Roman" w:eastAsia="Times New Roman" w:hAnsi="Times New Roman"/>
+          <w:b w:val="1"/>
+          <w:bCs w:val="1"/>
+          <w:sz w:val="32"/>
+          <w:szCs w:val="32"/>
           <w:rtl w:val="0"/>
         </w:rPr>
         <w:t xml:space="preserve">Giảng viên hướng dẫn: ThS. Hà Lê Hoài Trung</w:t>
@@ -1230,14 +1230,6 @@
         </w:rPr>
         <w:t xml:space="preserve">)</w:t>
       </w:r>
-    </w:p>
-    <w:p>
-      <w:pPr>
-        <w:rPr/>
-      </w:pPr>
-      <w:r>
-        <w:br w:type="page"/>
-      </w:r>
       <w:r>
         <w:rPr>
           <w:rtl w:val="0"/>
@@ -1252,68 +1244,48 @@
           <w:rFonts w:ascii="Times New Roman" w:cs="Times New Roman" w:eastAsia="Times New Roman" w:hAnsi="Times New Roman"/>
           <w:b w:val="1"/>
           <w:bCs w:val="1"/>
-          <w:sz w:val="26"/>
-          <w:szCs w:val="26"/>
-        </w:rPr>
-      </w:pPr>
-      <w:bookmarkStart w:colFirst="0" w:colLast="0" w:name="_heading=h.gxan00dg76d3" w:id="0"/>
-      <w:bookmarkEnd w:id="0"/>
-      <w:sdt>
-        <w:sdtPr>
-          <w:id w:val="-879319910"/>
-          <w:tag w:val="goog_rdk_0"/>
-        </w:sdtPr>
-        <w:sdtContent>
-          <w:r>
-            <w:rPr>
-              <w:rFonts w:ascii="Arial" w:cs="Arial" w:eastAsia="Arial" w:hAnsi="Arial"/>
-              <w:b w:val="1"/>
-              <w:bCs w:val="1"/>
-              <w:rtl w:val="0"/>
-            </w:rPr>
-            <w:t xml:space="preserve">CHƯƠNG II . LIỆT KÊ VÀ PHÂN LOẠI QUY TRÌNH NGHIỆP VỤ </w:t>
-          </w:r>
-        </w:sdtContent>
-      </w:sdt>
-      <w:r>
-        <w:rPr>
-          <w:rtl w:val="0"/>
-        </w:rPr>
-      </w:r>
-    </w:p>
-    <w:p>
-      <w:pPr>
-        <w:numPr>
-          <w:ilvl w:val="0"/>
-          <w:numId w:val="3"/>
-        </w:numPr>
-        <w:spacing w:after="0" w:lineRule="auto"/>
-        <w:ind w:left="720" w:hanging="360"/>
-        <w:rPr>
-          <w:rFonts w:ascii="Times New Roman" w:cs="Times New Roman" w:eastAsia="Times New Roman" w:hAnsi="Times New Roman"/>
-          <w:b w:val="1"/>
-          <w:bCs w:val="1"/>
-          <w:sz w:val="26"/>
-          <w:szCs w:val="26"/>
-        </w:rPr>
-      </w:pPr>
-      <w:r>
-        <w:rPr>
-          <w:rFonts w:ascii="Times New Roman" w:cs="Times New Roman" w:eastAsia="Times New Roman" w:hAnsi="Times New Roman"/>
-          <w:b w:val="1"/>
-          <w:bCs w:val="1"/>
-          <w:sz w:val="26"/>
-          <w:szCs w:val="26"/>
-          <w:rtl w:val="0"/>
-        </w:rPr>
-        <w:t xml:space="preserve">Kiến trúc quy trình</w:t>
+          <w:sz w:val="32"/>
+          <w:szCs w:val="32"/>
+        </w:rPr>
+      </w:pPr>
+      <w:r>
+        <w:rPr>
+          <w:rtl w:val="0"/>
+        </w:rPr>
+      </w:r>
+    </w:p>
+    <w:p>
+      <w:pPr>
+        <w:pStyle w:val="Heading1"/>
+        <w:jc w:val="center"/>
+        <w:rPr>
+          <w:rFonts w:ascii="Times New Roman" w:cs="Times New Roman" w:eastAsia="Times New Roman" w:hAnsi="Times New Roman"/>
+          <w:sz w:val="32"/>
+          <w:szCs w:val="32"/>
+        </w:rPr>
+      </w:pPr>
+      <w:r>
+        <w:rPr>
+          <w:rFonts w:ascii="Times New Roman" w:cs="Times New Roman" w:eastAsia="Times New Roman" w:hAnsi="Times New Roman"/>
+          <w:b w:val="1"/>
+          <w:bCs w:val="1"/>
+          <w:sz w:val="32"/>
+          <w:szCs w:val="32"/>
+          <w:rtl w:val="0"/>
+        </w:rPr>
+        <w:t xml:space="preserve">CHƯƠNG II . LIỆT KÊ VÀ PHÂN LOẠI QUY TRÌNH NGHIỆP VỤ </w:t>
+      </w:r>
+      <w:r>
+        <w:rPr>
+          <w:rtl w:val="0"/>
+        </w:rPr>
       </w:r>
     </w:p>
     <w:p>
       <w:pPr>
         <w:numPr>
           <w:ilvl w:val="1"/>
-          <w:numId w:val="3"/>
+          <w:numId w:val="5"/>
         </w:numPr>
         <w:spacing w:after="0" w:lineRule="auto"/>
         <w:ind w:left="1092" w:hanging="372"/>
@@ -1362,7 +1334,7 @@
           <w:szCs w:val="26"/>
           <w:rtl w:val="0"/>
         </w:rPr>
-        <w:t xml:space="preserve">2.1.1 Quy trình quản lý mua hàng và cung ứng</w:t>
+        <w:t xml:space="preserve">1.1.1 Quy trình quản lý mua hàng và cung ứng</w:t>
       </w:r>
     </w:p>
     <w:p>
@@ -1514,7 +1486,7 @@
           <w:szCs w:val="26"/>
           <w:rtl w:val="0"/>
         </w:rPr>
-        <w:t xml:space="preserve">2.1.2 Quy trình quản lý chất lượng và xử lý rủi ro</w:t>
+        <w:t xml:space="preserve">1.1.2 Quy trình quản lý chất lượng và xử lý rủi ro</w:t>
       </w:r>
     </w:p>
     <w:p>
@@ -1591,7 +1563,7 @@
           <wp:inline distB="114300" distT="114300" distL="114300" distR="114300">
             <wp:extent cx="5356800" cy="787439"/>
             <wp:effectExtent b="0" l="0" r="0" t="0"/>
-            <wp:docPr id="1" name="image3.png"/>
+            <wp:docPr id="2" name="image3.png"/>
             <a:graphic>
               <a:graphicData uri="http://schemas.openxmlformats.org/drawingml/2006/picture">
                 <pic:pic>
@@ -1628,48 +1600,51 @@
     </w:p>
     <w:p>
       <w:pPr>
-        <w:pStyle w:val="Heading1"/>
-        <w:jc w:val="center"/>
-        <w:rPr>
-          <w:rFonts w:ascii="Times New Roman" w:cs="Times New Roman" w:eastAsia="Times New Roman" w:hAnsi="Times New Roman"/>
+        <w:rPr>
           <w:b w:val="1"/>
           <w:bCs w:val="1"/>
           <w:i w:val="1"/>
           <w:iCs w:val="1"/>
-          <w:sz w:val="26"/>
-          <w:szCs w:val="26"/>
-        </w:rPr>
-      </w:pPr>
-      <w:bookmarkStart w:colFirst="0" w:colLast="0" w:name="_heading=h.9l78stoq0ezu" w:id="1"/>
-      <w:bookmarkEnd w:id="1"/>
-      <w:sdt>
-        <w:sdtPr>
-          <w:id w:val="827064029"/>
-          <w:tag w:val="goog_rdk_1"/>
-        </w:sdtPr>
-        <w:sdtContent>
-          <w:r>
-            <w:rPr>
-              <w:rFonts w:ascii="Arial" w:cs="Arial" w:eastAsia="Arial" w:hAnsi="Arial"/>
-              <w:b w:val="1"/>
-              <w:bCs w:val="1"/>
-              <w:rtl w:val="0"/>
-            </w:rPr>
-            <w:t xml:space="preserve">CHƯƠNG III . MÔ HÌNH HÓA QUY TRÌNH NGHIỆP VỤ </w:t>
-          </w:r>
-        </w:sdtContent>
-      </w:sdt>
-      <w:r>
-        <w:rPr>
-          <w:rtl w:val="0"/>
-        </w:rPr>
-      </w:r>
-    </w:p>
-    <w:p>
-      <w:pPr>
-        <w:spacing w:after="0" w:lineRule="auto"/>
-        <w:ind w:left="1092" w:firstLine="348"/>
-        <w:jc w:val="center"/>
+        </w:rPr>
+      </w:pPr>
+      <w:r>
+        <w:rPr>
+          <w:rtl w:val="0"/>
+        </w:rPr>
+      </w:r>
+    </w:p>
+    <w:p>
+      <w:pPr>
+        <w:pStyle w:val="Heading1"/>
+        <w:jc w:val="center"/>
+        <w:rPr>
+          <w:rFonts w:ascii="Times New Roman" w:cs="Times New Roman" w:eastAsia="Times New Roman" w:hAnsi="Times New Roman"/>
+          <w:b w:val="1"/>
+          <w:bCs w:val="1"/>
+          <w:sz w:val="32"/>
+          <w:szCs w:val="32"/>
+        </w:rPr>
+      </w:pPr>
+      <w:r>
+        <w:rPr>
+          <w:rFonts w:ascii="Times New Roman" w:cs="Times New Roman" w:eastAsia="Times New Roman" w:hAnsi="Times New Roman"/>
+          <w:b w:val="1"/>
+          <w:bCs w:val="1"/>
+          <w:sz w:val="32"/>
+          <w:szCs w:val="32"/>
+          <w:rtl w:val="0"/>
+        </w:rPr>
+        <w:t xml:space="preserve">CHƯƠNG III . MÔ HÌNH HÓA QUY TRÌNH NGHIỆP VỤ </w:t>
+      </w:r>
+    </w:p>
+    <w:p>
+      <w:pPr>
+        <w:numPr>
+          <w:ilvl w:val="0"/>
+          <w:numId w:val="2"/>
+        </w:numPr>
+        <w:spacing w:after="0" w:lineRule="auto"/>
+        <w:ind w:left="720" w:hanging="360"/>
         <w:rPr>
           <w:rFonts w:ascii="Times New Roman" w:cs="Times New Roman" w:eastAsia="Times New Roman" w:hAnsi="Times New Roman"/>
           <w:b w:val="1"/>
@@ -1682,8 +1657,112 @@
       </w:pPr>
       <w:r>
         <w:rPr>
-          <w:rtl w:val="0"/>
-        </w:rPr>
+          <w:rFonts w:ascii="Times New Roman" w:cs="Times New Roman" w:eastAsia="Times New Roman" w:hAnsi="Times New Roman"/>
+          <w:b w:val="1"/>
+          <w:bCs w:val="1"/>
+          <w:i w:val="1"/>
+          <w:iCs w:val="1"/>
+          <w:sz w:val="26"/>
+          <w:szCs w:val="26"/>
+          <w:rtl w:val="0"/>
+        </w:rPr>
+        <w:t xml:space="preserve">QUY TRÌNH QUẢN LÝ</w:t>
+      </w:r>
+    </w:p>
+    <w:p>
+      <w:pPr>
+        <w:numPr>
+          <w:ilvl w:val="1"/>
+          <w:numId w:val="2"/>
+        </w:numPr>
+        <w:spacing w:after="0" w:lineRule="auto"/>
+        <w:ind w:left="1092" w:hanging="372"/>
+        <w:rPr>
+          <w:rFonts w:ascii="Times New Roman" w:cs="Times New Roman" w:eastAsia="Times New Roman" w:hAnsi="Times New Roman"/>
+          <w:b w:val="1"/>
+          <w:bCs w:val="1"/>
+          <w:i w:val="1"/>
+          <w:iCs w:val="1"/>
+          <w:sz w:val="26"/>
+          <w:szCs w:val="26"/>
+        </w:rPr>
+      </w:pPr>
+      <w:r>
+        <w:rPr>
+          <w:rFonts w:ascii="Times New Roman" w:cs="Times New Roman" w:eastAsia="Times New Roman" w:hAnsi="Times New Roman"/>
+          <w:b w:val="1"/>
+          <w:bCs w:val="1"/>
+          <w:i w:val="1"/>
+          <w:iCs w:val="1"/>
+          <w:sz w:val="26"/>
+          <w:szCs w:val="26"/>
+          <w:rtl w:val="0"/>
+        </w:rPr>
+        <w:t xml:space="preserve">Quy trình quản lý mua hàng và cung ứng</w:t>
+      </w:r>
+    </w:p>
+    <w:p>
+      <w:pPr>
+        <w:numPr>
+          <w:ilvl w:val="2"/>
+          <w:numId w:val="2"/>
+        </w:numPr>
+        <w:spacing w:after="0" w:lineRule="auto"/>
+        <w:ind w:left="1800" w:hanging="720"/>
+        <w:rPr>
+          <w:rFonts w:ascii="Times New Roman" w:cs="Times New Roman" w:eastAsia="Times New Roman" w:hAnsi="Times New Roman"/>
+          <w:b w:val="1"/>
+          <w:bCs w:val="1"/>
+          <w:i w:val="1"/>
+          <w:iCs w:val="1"/>
+          <w:sz w:val="26"/>
+          <w:szCs w:val="26"/>
+        </w:rPr>
+      </w:pPr>
+      <w:r>
+        <w:rPr>
+          <w:rFonts w:ascii="Times New Roman" w:cs="Times New Roman" w:eastAsia="Times New Roman" w:hAnsi="Times New Roman"/>
+          <w:b w:val="1"/>
+          <w:bCs w:val="1"/>
+          <w:i w:val="1"/>
+          <w:iCs w:val="1"/>
+          <w:sz w:val="26"/>
+          <w:szCs w:val="26"/>
+          <w:rtl w:val="0"/>
+        </w:rPr>
+        <w:t xml:space="preserve">Phương pháp thực hiện</w:t>
+      </w:r>
+    </w:p>
+    <w:p>
+      <w:pPr>
+        <w:numPr>
+          <w:ilvl w:val="2"/>
+          <w:numId w:val="2"/>
+        </w:numPr>
+        <w:spacing w:after="0" w:lineRule="auto"/>
+        <w:ind w:left="1800" w:hanging="720"/>
+        <w:rPr>
+          <w:rFonts w:ascii="Times New Roman" w:cs="Times New Roman" w:eastAsia="Times New Roman" w:hAnsi="Times New Roman"/>
+          <w:b w:val="1"/>
+          <w:bCs w:val="1"/>
+          <w:i w:val="1"/>
+          <w:iCs w:val="1"/>
+          <w:sz w:val="26"/>
+          <w:szCs w:val="26"/>
+        </w:rPr>
+      </w:pPr>
+      <w:r>
+        <w:rPr>
+          <w:rFonts w:ascii="Times New Roman" w:cs="Times New Roman" w:eastAsia="Times New Roman" w:hAnsi="Times New Roman"/>
+          <w:b w:val="1"/>
+          <w:bCs w:val="1"/>
+          <w:i w:val="1"/>
+          <w:iCs w:val="1"/>
+          <w:sz w:val="26"/>
+          <w:szCs w:val="26"/>
+          <w:rtl w:val="0"/>
+        </w:rPr>
+        <w:t xml:space="preserve">Mô tả quy trình</w:t>
       </w:r>
     </w:p>
     <w:p>
@@ -1693,7 +1772,147 @@
           <w:numId w:val="1"/>
         </w:numPr>
         <w:spacing w:after="0" w:lineRule="auto"/>
-        <w:ind w:left="720" w:hanging="360"/>
+        <w:ind w:left="1440" w:hanging="360"/>
+        <w:rPr>
+          <w:rFonts w:ascii="Times New Roman" w:cs="Times New Roman" w:eastAsia="Times New Roman" w:hAnsi="Times New Roman"/>
+          <w:sz w:val="26"/>
+          <w:szCs w:val="26"/>
+        </w:rPr>
+      </w:pPr>
+      <w:r>
+        <w:rPr>
+          <w:rFonts w:ascii="Times New Roman" w:cs="Times New Roman" w:eastAsia="Times New Roman" w:hAnsi="Times New Roman"/>
+          <w:sz w:val="26"/>
+          <w:szCs w:val="26"/>
+          <w:rtl w:val="0"/>
+        </w:rPr>
+        <w:t xml:space="preserve">Lập kế hoạch cung ứng: hệ thống tổng hợp dữ liệu hàng tồn kho tại kho hàng trung tâm và tại nhà thuốc. Phòng kế hoạch tính toán lượng thuốc và vật tư y tế cần nhập để đảm bảo nguồn hàng không bị hết và đảm bảo không nhập quá nhiều để tồn đọng</w:t>
+      </w:r>
+    </w:p>
+    <w:p>
+      <w:pPr>
+        <w:numPr>
+          <w:ilvl w:val="0"/>
+          <w:numId w:val="1"/>
+        </w:numPr>
+        <w:spacing w:after="0" w:lineRule="auto"/>
+        <w:ind w:left="1440" w:hanging="360"/>
+        <w:rPr>
+          <w:rFonts w:ascii="Times New Roman" w:cs="Times New Roman" w:eastAsia="Times New Roman" w:hAnsi="Times New Roman"/>
+          <w:sz w:val="26"/>
+          <w:szCs w:val="26"/>
+        </w:rPr>
+      </w:pPr>
+      <w:r>
+        <w:rPr>
+          <w:rFonts w:ascii="Times New Roman" w:cs="Times New Roman" w:eastAsia="Times New Roman" w:hAnsi="Times New Roman"/>
+          <w:sz w:val="26"/>
+          <w:szCs w:val="26"/>
+          <w:rtl w:val="0"/>
+        </w:rPr>
+        <w:t xml:space="preserve">Phát hành đơn đặt hàng: Phòng mua hàng tạo đơn đặt hàng trên hệ thống và gửi cho nhà cung cấp</w:t>
+      </w:r>
+      <w:r>
+        <w:rPr>
+          <w:rtl w:val="0"/>
+        </w:rPr>
+      </w:r>
+    </w:p>
+    <w:p>
+      <w:pPr>
+        <w:numPr>
+          <w:ilvl w:val="0"/>
+          <w:numId w:val="1"/>
+        </w:numPr>
+        <w:spacing w:after="0" w:lineRule="auto"/>
+        <w:ind w:left="1440" w:hanging="360"/>
+        <w:rPr>
+          <w:rFonts w:ascii="Times New Roman" w:cs="Times New Roman" w:eastAsia="Times New Roman" w:hAnsi="Times New Roman"/>
+          <w:sz w:val="26"/>
+          <w:szCs w:val="26"/>
+        </w:rPr>
+      </w:pPr>
+      <w:r>
+        <w:rPr>
+          <w:rFonts w:ascii="Times New Roman" w:cs="Times New Roman" w:eastAsia="Times New Roman" w:hAnsi="Times New Roman"/>
+          <w:sz w:val="26"/>
+          <w:szCs w:val="26"/>
+          <w:rtl w:val="0"/>
+        </w:rPr>
+        <w:t xml:space="preserve">Giao nhận và kiểm tra chất lượng: nhà cung cấp giao hàng tới kho hàng trung tâm, nhân viên kho kiểm tra: số lượng, chất lượng, hạn sử dụng sản phẩm và điều kiện bảo quản thực tế khi giao hàng</w:t>
+      </w:r>
+      <w:r>
+        <w:rPr>
+          <w:rtl w:val="0"/>
+        </w:rPr>
+      </w:r>
+    </w:p>
+    <w:p>
+      <w:pPr>
+        <w:numPr>
+          <w:ilvl w:val="0"/>
+          <w:numId w:val="1"/>
+        </w:numPr>
+        <w:spacing w:after="0" w:lineRule="auto"/>
+        <w:ind w:left="1440" w:hanging="360"/>
+        <w:rPr>
+          <w:rFonts w:ascii="Times New Roman" w:cs="Times New Roman" w:eastAsia="Times New Roman" w:hAnsi="Times New Roman"/>
+          <w:sz w:val="26"/>
+          <w:szCs w:val="26"/>
+        </w:rPr>
+      </w:pPr>
+      <w:r>
+        <w:rPr>
+          <w:rFonts w:ascii="Times New Roman" w:cs="Times New Roman" w:eastAsia="Times New Roman" w:hAnsi="Times New Roman"/>
+          <w:sz w:val="26"/>
+          <w:szCs w:val="26"/>
+          <w:rtl w:val="0"/>
+        </w:rPr>
+        <w:t xml:space="preserve">Lưu kho và phân phối: cập nhật số lượng vào hệ thống phần mềm, sau đó cho nhập kho hoặc có thể phân phối trực tiếp ra các nhà thuốc trên toàn quốc</w:t>
+      </w:r>
+      <w:r>
+        <w:rPr>
+          <w:rtl w:val="0"/>
+        </w:rPr>
+      </w:r>
+    </w:p>
+    <w:p>
+      <w:pPr>
+        <w:numPr>
+          <w:ilvl w:val="0"/>
+          <w:numId w:val="1"/>
+        </w:numPr>
+        <w:spacing w:after="0" w:lineRule="auto"/>
+        <w:ind w:left="1440" w:hanging="360"/>
+        <w:rPr>
+          <w:rFonts w:ascii="Times New Roman" w:cs="Times New Roman" w:eastAsia="Times New Roman" w:hAnsi="Times New Roman"/>
+          <w:sz w:val="26"/>
+          <w:szCs w:val="26"/>
+        </w:rPr>
+      </w:pPr>
+      <w:r>
+        <w:rPr>
+          <w:rFonts w:ascii="Times New Roman" w:cs="Times New Roman" w:eastAsia="Times New Roman" w:hAnsi="Times New Roman"/>
+          <w:sz w:val="26"/>
+          <w:szCs w:val="26"/>
+          <w:rtl w:val="0"/>
+        </w:rPr>
+        <w:t xml:space="preserve">Thanh toán cho nhà cung cấp: Kế toán đối chiếu dữ liệu nhập khi thực tế và hóa đơn của nhà cung cấp, nếu khớp bắt đầu thành toán cho nhà cung cấp.</w:t>
+      </w:r>
+      <w:r>
+        <w:rPr>
+          <w:rtl w:val="0"/>
+        </w:rPr>
+      </w:r>
+    </w:p>
+    <w:p>
+      <w:pPr>
+        <w:numPr>
+          <w:ilvl w:val="2"/>
+          <w:numId w:val="2"/>
+        </w:numPr>
+        <w:spacing w:after="0" w:lineRule="auto"/>
+        <w:ind w:left="1800" w:hanging="720"/>
         <w:rPr>
           <w:rFonts w:ascii="Times New Roman" w:cs="Times New Roman" w:eastAsia="Times New Roman" w:hAnsi="Times New Roman"/>
           <w:b w:val="1"/>
@@ -1715,14 +1934,415 @@
           <w:szCs w:val="26"/>
           <w:rtl w:val="0"/>
         </w:rPr>
-        <w:t xml:space="preserve">QUY TRÌNH QUẢN LÝ</w:t>
+        <w:t xml:space="preserve">Phân tích quy trình</w:t>
+      </w:r>
+    </w:p>
+    <w:p>
+      <w:pPr>
+        <w:numPr>
+          <w:ilvl w:val="0"/>
+          <w:numId w:val="4"/>
+        </w:numPr>
+        <w:spacing w:after="0" w:lineRule="auto"/>
+        <w:ind w:left="1440" w:hanging="360"/>
+        <w:rPr>
+          <w:rFonts w:ascii="Times New Roman" w:cs="Times New Roman" w:eastAsia="Times New Roman" w:hAnsi="Times New Roman"/>
+          <w:b w:val="1"/>
+          <w:bCs w:val="1"/>
+          <w:sz w:val="26"/>
+          <w:szCs w:val="26"/>
+        </w:rPr>
+      </w:pPr>
+      <w:r>
+        <w:rPr>
+          <w:rFonts w:ascii="Times New Roman" w:cs="Times New Roman" w:eastAsia="Times New Roman" w:hAnsi="Times New Roman"/>
+          <w:b w:val="1"/>
+          <w:bCs w:val="1"/>
+          <w:sz w:val="26"/>
+          <w:szCs w:val="26"/>
+          <w:rtl w:val="0"/>
+        </w:rPr>
+        <w:t xml:space="preserve">Các tác nhân tham gia quy trình</w:t>
       </w:r>
     </w:p>
     <w:p>
       <w:pPr>
         <w:numPr>
           <w:ilvl w:val="1"/>
-          <w:numId w:val="1"/>
+          <w:numId w:val="3"/>
+        </w:numPr>
+        <w:spacing w:after="0" w:lineRule="auto"/>
+        <w:ind w:left="2160" w:hanging="360"/>
+        <w:rPr>
+          <w:sz w:val="26"/>
+          <w:szCs w:val="26"/>
+        </w:rPr>
+      </w:pPr>
+      <w:r>
+        <w:rPr>
+          <w:rFonts w:ascii="Times New Roman" w:cs="Times New Roman" w:eastAsia="Times New Roman" w:hAnsi="Times New Roman"/>
+          <w:sz w:val="26"/>
+          <w:szCs w:val="26"/>
+          <w:rtl w:val="0"/>
+        </w:rPr>
+        <w:t xml:space="preserve">Phòng kế hoạch: dự báo nhu cầu thuốc dựa trên lịch sử bán hàng và dịch bệnh gần đây lên kế hoạch mua hàng</w:t>
+      </w:r>
+      <w:r>
+        <w:rPr>
+          <w:rtl w:val="0"/>
+        </w:rPr>
+      </w:r>
+    </w:p>
+    <w:p>
+      <w:pPr>
+        <w:numPr>
+          <w:ilvl w:val="1"/>
+          <w:numId w:val="3"/>
+        </w:numPr>
+        <w:spacing w:after="0" w:lineRule="auto"/>
+        <w:ind w:left="2160" w:hanging="360"/>
+        <w:rPr>
+          <w:sz w:val="26"/>
+          <w:szCs w:val="26"/>
+          <w:u w:val="none"/>
+        </w:rPr>
+      </w:pPr>
+      <w:r>
+        <w:rPr>
+          <w:rFonts w:ascii="Times New Roman" w:cs="Times New Roman" w:eastAsia="Times New Roman" w:hAnsi="Times New Roman"/>
+          <w:sz w:val="26"/>
+          <w:szCs w:val="26"/>
+          <w:rtl w:val="0"/>
+        </w:rPr>
+        <w:t xml:space="preserve">Phòng mua hàng: tìm kiếm, đánh giá và chốt hợp đồng với nhà cung cấp thuốc và vật tư y tế</w:t>
+      </w:r>
+      <w:r>
+        <w:rPr>
+          <w:rtl w:val="0"/>
+        </w:rPr>
+      </w:r>
+    </w:p>
+    <w:p>
+      <w:pPr>
+        <w:numPr>
+          <w:ilvl w:val="1"/>
+          <w:numId w:val="3"/>
+        </w:numPr>
+        <w:spacing w:after="0" w:lineRule="auto"/>
+        <w:ind w:left="2160" w:hanging="360"/>
+        <w:rPr>
+          <w:sz w:val="26"/>
+          <w:szCs w:val="26"/>
+          <w:u w:val="none"/>
+        </w:rPr>
+      </w:pPr>
+      <w:r>
+        <w:rPr>
+          <w:rFonts w:ascii="Times New Roman" w:cs="Times New Roman" w:eastAsia="Times New Roman" w:hAnsi="Times New Roman"/>
+          <w:sz w:val="26"/>
+          <w:szCs w:val="26"/>
+          <w:rtl w:val="0"/>
+        </w:rPr>
+        <w:t xml:space="preserve">Nhà cung cấp: các công ty dược phẩm, các nhà cung cấp vật tư y tế</w:t>
+      </w:r>
+      <w:r>
+        <w:rPr>
+          <w:rtl w:val="0"/>
+        </w:rPr>
+      </w:r>
+    </w:p>
+    <w:p>
+      <w:pPr>
+        <w:numPr>
+          <w:ilvl w:val="1"/>
+          <w:numId w:val="3"/>
+        </w:numPr>
+        <w:spacing w:after="0" w:lineRule="auto"/>
+        <w:ind w:left="2160" w:hanging="360"/>
+        <w:rPr>
+          <w:sz w:val="26"/>
+          <w:szCs w:val="26"/>
+          <w:u w:val="none"/>
+        </w:rPr>
+      </w:pPr>
+      <w:r>
+        <w:rPr>
+          <w:rFonts w:ascii="Times New Roman" w:cs="Times New Roman" w:eastAsia="Times New Roman" w:hAnsi="Times New Roman"/>
+          <w:sz w:val="26"/>
+          <w:szCs w:val="26"/>
+          <w:rtl w:val="0"/>
+        </w:rPr>
+        <w:t xml:space="preserve">Kho hàng trung tâm: nhận hàng, kiểm tra và bảo quản</w:t>
+      </w:r>
+      <w:r>
+        <w:rPr>
+          <w:rtl w:val="0"/>
+        </w:rPr>
+      </w:r>
+    </w:p>
+    <w:p>
+      <w:pPr>
+        <w:numPr>
+          <w:ilvl w:val="1"/>
+          <w:numId w:val="3"/>
+        </w:numPr>
+        <w:spacing w:after="0" w:lineRule="auto"/>
+        <w:ind w:left="2160" w:hanging="360"/>
+        <w:rPr>
+          <w:sz w:val="26"/>
+          <w:szCs w:val="26"/>
+          <w:u w:val="none"/>
+        </w:rPr>
+      </w:pPr>
+      <w:r>
+        <w:rPr>
+          <w:rFonts w:ascii="Times New Roman" w:cs="Times New Roman" w:eastAsia="Times New Roman" w:hAnsi="Times New Roman"/>
+          <w:sz w:val="26"/>
+          <w:szCs w:val="26"/>
+          <w:rtl w:val="0"/>
+        </w:rPr>
+        <w:t xml:space="preserve">Phòng kế toán: nhận hóa đơn và thanh toán cho nhà cung cấp</w:t>
+      </w:r>
+      <w:r>
+        <w:rPr>
+          <w:rtl w:val="0"/>
+        </w:rPr>
+      </w:r>
+    </w:p>
+    <w:p>
+      <w:pPr>
+        <w:numPr>
+          <w:ilvl w:val="1"/>
+          <w:numId w:val="3"/>
+        </w:numPr>
+        <w:spacing w:after="0" w:lineRule="auto"/>
+        <w:ind w:left="2160" w:hanging="360"/>
+        <w:rPr>
+          <w:sz w:val="26"/>
+          <w:szCs w:val="26"/>
+          <w:u w:val="none"/>
+        </w:rPr>
+      </w:pPr>
+      <w:r>
+        <w:rPr>
+          <w:rFonts w:ascii="Times New Roman" w:cs="Times New Roman" w:eastAsia="Times New Roman" w:hAnsi="Times New Roman"/>
+          <w:sz w:val="26"/>
+          <w:szCs w:val="26"/>
+          <w:rtl w:val="0"/>
+        </w:rPr>
+        <w:t xml:space="preserve">Quản lý của nhà thuốc: người tiếp nhận thuốc tại chi nhánh bán lẻ</w:t>
+      </w:r>
+      <w:r>
+        <w:rPr>
+          <w:rtl w:val="0"/>
+        </w:rPr>
+      </w:r>
+    </w:p>
+    <w:p>
+      <w:pPr>
+        <w:numPr>
+          <w:ilvl w:val="0"/>
+          <w:numId w:val="4"/>
+        </w:numPr>
+        <w:spacing w:after="0" w:lineRule="auto"/>
+        <w:ind w:left="1440" w:hanging="360"/>
+        <w:rPr>
+          <w:rFonts w:ascii="Times New Roman" w:cs="Times New Roman" w:eastAsia="Times New Roman" w:hAnsi="Times New Roman"/>
+          <w:b w:val="1"/>
+          <w:bCs w:val="1"/>
+          <w:sz w:val="26"/>
+          <w:szCs w:val="26"/>
+        </w:rPr>
+      </w:pPr>
+      <w:r>
+        <w:rPr>
+          <w:rFonts w:ascii="Times New Roman" w:cs="Times New Roman" w:eastAsia="Times New Roman" w:hAnsi="Times New Roman"/>
+          <w:b w:val="1"/>
+          <w:bCs w:val="1"/>
+          <w:sz w:val="26"/>
+          <w:szCs w:val="26"/>
+          <w:rtl w:val="0"/>
+        </w:rPr>
+        <w:t xml:space="preserve">Khách hàng của quy trình này</w:t>
+      </w:r>
+    </w:p>
+    <w:p>
+      <w:pPr>
+        <w:numPr>
+          <w:ilvl w:val="1"/>
+          <w:numId w:val="3"/>
+        </w:numPr>
+        <w:spacing w:after="0" w:lineRule="auto"/>
+        <w:ind w:left="2160" w:hanging="360"/>
+        <w:rPr>
+          <w:sz w:val="26"/>
+          <w:szCs w:val="26"/>
+        </w:rPr>
+      </w:pPr>
+      <w:r>
+        <w:rPr>
+          <w:rFonts w:ascii="Times New Roman" w:cs="Times New Roman" w:eastAsia="Times New Roman" w:hAnsi="Times New Roman"/>
+          <w:sz w:val="26"/>
+          <w:szCs w:val="26"/>
+          <w:rtl w:val="0"/>
+        </w:rPr>
+        <w:t xml:space="preserve">Khách hàng của quy trình chính là các chi nhánh nhà thuốc, vì họ cần quy trình này để có đủ thuốc với chất lượng tốt và đúng thời điểm để bán ra cho người mua hàng, và cũng chính là đối tượng hưởng lợi từ quy trình.</w:t>
+      </w:r>
+      <w:r>
+        <w:rPr>
+          <w:rtl w:val="0"/>
+        </w:rPr>
+      </w:r>
+    </w:p>
+    <w:p>
+      <w:pPr>
+        <w:numPr>
+          <w:ilvl w:val="0"/>
+          <w:numId w:val="4"/>
+        </w:numPr>
+        <w:spacing w:after="0" w:lineRule="auto"/>
+        <w:ind w:left="1440" w:hanging="360"/>
+        <w:rPr>
+          <w:rFonts w:ascii="Times New Roman" w:cs="Times New Roman" w:eastAsia="Times New Roman" w:hAnsi="Times New Roman"/>
+          <w:b w:val="1"/>
+          <w:bCs w:val="1"/>
+          <w:sz w:val="26"/>
+          <w:szCs w:val="26"/>
+        </w:rPr>
+      </w:pPr>
+      <w:r>
+        <w:rPr>
+          <w:rFonts w:ascii="Times New Roman" w:cs="Times New Roman" w:eastAsia="Times New Roman" w:hAnsi="Times New Roman"/>
+          <w:b w:val="1"/>
+          <w:bCs w:val="1"/>
+          <w:sz w:val="26"/>
+          <w:szCs w:val="26"/>
+          <w:rtl w:val="0"/>
+        </w:rPr>
+        <w:t xml:space="preserve">Những khả năng kết quả của quy trình</w:t>
+      </w:r>
+    </w:p>
+    <w:p>
+      <w:pPr>
+        <w:numPr>
+          <w:ilvl w:val="1"/>
+          <w:numId w:val="3"/>
+        </w:numPr>
+        <w:spacing w:after="0" w:lineRule="auto"/>
+        <w:ind w:left="2160" w:hanging="360"/>
+        <w:rPr>
+          <w:sz w:val="26"/>
+          <w:szCs w:val="26"/>
+        </w:rPr>
+      </w:pPr>
+      <w:r>
+        <w:rPr>
+          <w:rFonts w:ascii="Times New Roman" w:cs="Times New Roman" w:eastAsia="Times New Roman" w:hAnsi="Times New Roman"/>
+          <w:sz w:val="26"/>
+          <w:szCs w:val="26"/>
+          <w:rtl w:val="0"/>
+        </w:rPr>
+        <w:t xml:space="preserve">Kết quả tích cực: Hàng hóa nhập kho đầy đủ, đúng tiêu chuẩn chất lượng, hạn sử dụng dài, chi phí tối ưu và kịp thời phân bổ về nhà thuốc.</w:t>
+      </w:r>
+      <w:r>
+        <w:rPr>
+          <w:rtl w:val="0"/>
+        </w:rPr>
+      </w:r>
+    </w:p>
+    <w:p>
+      <w:pPr>
+        <w:numPr>
+          <w:ilvl w:val="1"/>
+          <w:numId w:val="3"/>
+        </w:numPr>
+        <w:spacing w:after="0" w:lineRule="auto"/>
+        <w:ind w:left="2160" w:hanging="360"/>
+        <w:rPr>
+          <w:sz w:val="26"/>
+          <w:szCs w:val="26"/>
+          <w:u w:val="none"/>
+        </w:rPr>
+      </w:pPr>
+      <w:r>
+        <w:rPr>
+          <w:rFonts w:ascii="Times New Roman" w:cs="Times New Roman" w:eastAsia="Times New Roman" w:hAnsi="Times New Roman"/>
+          <w:sz w:val="26"/>
+          <w:szCs w:val="26"/>
+          <w:rtl w:val="0"/>
+        </w:rPr>
+        <w:t xml:space="preserve">Kết quả tiêu cực</w:t>
+      </w:r>
+      <w:r>
+        <w:rPr>
+          <w:rtl w:val="0"/>
+        </w:rPr>
+      </w:r>
+    </w:p>
+    <w:p>
+      <w:pPr>
+        <w:numPr>
+          <w:ilvl w:val="2"/>
+          <w:numId w:val="3"/>
+        </w:numPr>
+        <w:spacing w:after="0" w:lineRule="auto"/>
+        <w:ind w:left="2880" w:hanging="360"/>
+        <w:rPr>
+          <w:b w:val="1"/>
+          <w:bCs w:val="1"/>
+          <w:sz w:val="26"/>
+          <w:szCs w:val="26"/>
+        </w:rPr>
+      </w:pPr>
+      <w:r>
+        <w:rPr>
+          <w:rFonts w:ascii="Times New Roman" w:cs="Times New Roman" w:eastAsia="Times New Roman" w:hAnsi="Times New Roman"/>
+          <w:sz w:val="26"/>
+          <w:szCs w:val="26"/>
+          <w:rtl w:val="0"/>
+        </w:rPr>
+        <w:t xml:space="preserve">Hàng bị từ chối nhận tại kho do gần tới ngày hết hạn, móp méo hộp bao bì, hoặc không đạt chuẩn bảo quản nhiệt độ.</w:t>
+      </w:r>
+      <w:r>
+        <w:rPr>
+          <w:rtl w:val="0"/>
+        </w:rPr>
+      </w:r>
+    </w:p>
+    <w:p>
+      <w:pPr>
+        <w:numPr>
+          <w:ilvl w:val="2"/>
+          <w:numId w:val="3"/>
+        </w:numPr>
+        <w:spacing w:after="0" w:lineRule="auto"/>
+        <w:ind w:left="2880" w:hanging="360"/>
+        <w:rPr>
+          <w:sz w:val="26"/>
+          <w:szCs w:val="26"/>
+          <w:u w:val="none"/>
+        </w:rPr>
+      </w:pPr>
+      <w:r>
+        <w:rPr>
+          <w:rFonts w:ascii="Times New Roman" w:cs="Times New Roman" w:eastAsia="Times New Roman" w:hAnsi="Times New Roman"/>
+          <w:sz w:val="26"/>
+          <w:szCs w:val="26"/>
+          <w:rtl w:val="0"/>
+        </w:rPr>
+        <w:t xml:space="preserve">Nhà cung cấp giao không đủ số lượng yêu cầu một số mặt hàng thiết yếu, dẫn đến tình trạng khan hiếm hàng tại các nhà thuốc.</w:t>
+      </w:r>
+      <w:r>
+        <w:rPr>
+          <w:rtl w:val="0"/>
+        </w:rPr>
+      </w:r>
+    </w:p>
+    <w:p>
+      <w:pPr>
+        <w:numPr>
+          <w:ilvl w:val="1"/>
+          <w:numId w:val="2"/>
         </w:numPr>
         <w:spacing w:after="0" w:lineRule="auto"/>
         <w:ind w:left="1092" w:hanging="372"/>
@@ -1747,14 +2367,14 @@
           <w:szCs w:val="26"/>
           <w:rtl w:val="0"/>
         </w:rPr>
-        <w:t xml:space="preserve">Quy trình quản lý mua hàng và cung ứng</w:t>
+        <w:t xml:space="preserve">Quy trình quản lý chất lượng và xử lý rủi ro</w:t>
       </w:r>
     </w:p>
     <w:p>
       <w:pPr>
         <w:numPr>
           <w:ilvl w:val="2"/>
-          <w:numId w:val="1"/>
+          <w:numId w:val="2"/>
         </w:numPr>
         <w:spacing w:after="0" w:lineRule="auto"/>
         <w:ind w:left="1800" w:hanging="720"/>
@@ -1786,7 +2406,7 @@
       <w:pPr>
         <w:numPr>
           <w:ilvl w:val="2"/>
-          <w:numId w:val="1"/>
+          <w:numId w:val="2"/>
         </w:numPr>
         <w:spacing w:after="0" w:lineRule="auto"/>
         <w:ind w:left="1800" w:hanging="720"/>
@@ -1818,7 +2438,7 @@
       <w:pPr>
         <w:numPr>
           <w:ilvl w:val="0"/>
-          <w:numId w:val="4"/>
+          <w:numId w:val="1"/>
         </w:numPr>
         <w:spacing w:after="0" w:lineRule="auto"/>
         <w:ind w:left="1440" w:hanging="360"/>
@@ -1835,7 +2455,174 @@
           <w:szCs w:val="26"/>
           <w:rtl w:val="0"/>
         </w:rPr>
-        <w:t xml:space="preserve">Lập kế hoạch cung ứng: hệ thống tổng hợp dữ liệu hàng tồn kho tại kho hàng trung tâm và tại nhà thuốc. Phòng kế hoạch tính toán lượng thuốc và vật tư y tế cần nhập để đảm bảo nguồn hàng không bị hết và đảm bảo không nhập quá nhiều để tồn đọng</w:t>
+        <w:t xml:space="preserve">Xây dựng tiêu chuẩn chất lượng: ban quản lý chất lượng xây dựng các quy trình các thao tác chuẩn theo quy định của bộ y tế về bảo quản, tư vấn và bán thuốc</w:t>
+      </w:r>
+    </w:p>
+    <w:p>
+      <w:pPr>
+        <w:numPr>
+          <w:ilvl w:val="0"/>
+          <w:numId w:val="1"/>
+        </w:numPr>
+        <w:spacing w:after="0" w:lineRule="auto"/>
+        <w:ind w:left="1440" w:hanging="360"/>
+        <w:rPr>
+          <w:rFonts w:ascii="Times New Roman" w:cs="Times New Roman" w:eastAsia="Times New Roman" w:hAnsi="Times New Roman"/>
+          <w:sz w:val="26"/>
+          <w:szCs w:val="26"/>
+        </w:rPr>
+      </w:pPr>
+      <w:r>
+        <w:rPr>
+          <w:rFonts w:ascii="Times New Roman" w:cs="Times New Roman" w:eastAsia="Times New Roman" w:hAnsi="Times New Roman"/>
+          <w:sz w:val="26"/>
+          <w:szCs w:val="26"/>
+          <w:rtl w:val="0"/>
+        </w:rPr>
+        <w:t xml:space="preserve">Giám sát và kiểm tra định kỳ: ban quản lý sẽ cử các đội kiểm tra định kỳ hoặc đột xuất tại kho hàng trung tâm và các nhà thuốc (hạn sử dụng thuốc trên kệ gần hết hạn chưa, nhiệt độ để bảo quản thuốc đủ chưa, nhiệt độ tủ lạnh để bảo quản vắc xin…)</w:t>
+      </w:r>
+      <w:r>
+        <w:rPr>
+          <w:rtl w:val="0"/>
+        </w:rPr>
+      </w:r>
+    </w:p>
+    <w:p>
+      <w:pPr>
+        <w:numPr>
+          <w:ilvl w:val="0"/>
+          <w:numId w:val="1"/>
+        </w:numPr>
+        <w:spacing w:after="0" w:lineRule="auto"/>
+        <w:ind w:left="1440" w:hanging="360"/>
+        <w:rPr>
+          <w:rFonts w:ascii="Times New Roman" w:cs="Times New Roman" w:eastAsia="Times New Roman" w:hAnsi="Times New Roman"/>
+          <w:sz w:val="26"/>
+          <w:szCs w:val="26"/>
+        </w:rPr>
+      </w:pPr>
+      <w:r>
+        <w:rPr>
+          <w:rFonts w:ascii="Times New Roman" w:cs="Times New Roman" w:eastAsia="Times New Roman" w:hAnsi="Times New Roman"/>
+          <w:sz w:val="26"/>
+          <w:szCs w:val="26"/>
+          <w:rtl w:val="0"/>
+        </w:rPr>
+        <w:t xml:space="preserve">Ghi nhận rủi ro và sự cố: ghi nhận thông tin trong quá trình kiểm tra nếu thuốc sắp hết hạn mà chưa được hạ kệ, khiếu nại từ khách hàng về chất lượng sản phẩm, hoặc thông báo thu hồi thuốc từ cơ quan quản lý nhà nước</w:t>
+      </w:r>
+      <w:r>
+        <w:rPr>
+          <w:rtl w:val="0"/>
+        </w:rPr>
+      </w:r>
+    </w:p>
+    <w:p>
+      <w:pPr>
+        <w:numPr>
+          <w:ilvl w:val="0"/>
+          <w:numId w:val="1"/>
+        </w:numPr>
+        <w:spacing w:after="0" w:lineRule="auto"/>
+        <w:ind w:left="1440" w:hanging="360"/>
+        <w:rPr>
+          <w:rFonts w:ascii="Times New Roman" w:cs="Times New Roman" w:eastAsia="Times New Roman" w:hAnsi="Times New Roman"/>
+          <w:sz w:val="26"/>
+          <w:szCs w:val="26"/>
+        </w:rPr>
+      </w:pPr>
+      <w:r>
+        <w:rPr>
+          <w:rFonts w:ascii="Times New Roman" w:cs="Times New Roman" w:eastAsia="Times New Roman" w:hAnsi="Times New Roman"/>
+          <w:sz w:val="26"/>
+          <w:szCs w:val="26"/>
+          <w:rtl w:val="0"/>
+        </w:rPr>
+        <w:t xml:space="preserve">Thu hồi sản phẩm và xử lý: khóa sản phẩm bị lỗi hoặc sắp hết hạn trên hệ thống không được bán tiếp, và đưa sản phẩm vào kho cách biệt với các sản phẩm khác. Ban quản lý chất lượng tiến hành điều tra nguyên nhân để xử lý</w:t>
+      </w:r>
+      <w:r>
+        <w:rPr>
+          <w:rtl w:val="0"/>
+        </w:rPr>
+      </w:r>
+    </w:p>
+    <w:p>
+      <w:pPr>
+        <w:numPr>
+          <w:ilvl w:val="0"/>
+          <w:numId w:val="1"/>
+        </w:numPr>
+        <w:spacing w:after="0" w:lineRule="auto"/>
+        <w:ind w:left="1440" w:hanging="360"/>
+        <w:rPr>
+          <w:rFonts w:ascii="Times New Roman" w:cs="Times New Roman" w:eastAsia="Times New Roman" w:hAnsi="Times New Roman"/>
+          <w:sz w:val="26"/>
+          <w:szCs w:val="26"/>
+        </w:rPr>
+      </w:pPr>
+      <w:r>
+        <w:rPr>
+          <w:rFonts w:ascii="Times New Roman" w:cs="Times New Roman" w:eastAsia="Times New Roman" w:hAnsi="Times New Roman"/>
+          <w:sz w:val="26"/>
+          <w:szCs w:val="26"/>
+          <w:rtl w:val="0"/>
+        </w:rPr>
+        <w:t xml:space="preserve">Khắc phục và cải tiến: Trả lại hàng bị lỗi cho nhà cung cấp hoặc đem đi tiêu hủy an toàn. Phổ biến lỗi, đào tạo lại dược sĩ và cập nhật quy trình để tránh lặp lại sai lầm tương tự</w:t>
+      </w:r>
+      <w:r>
+        <w:rPr>
+          <w:rtl w:val="0"/>
+        </w:rPr>
+      </w:r>
+    </w:p>
+    <w:p>
+      <w:pPr>
+        <w:spacing w:after="0" w:lineRule="auto"/>
+        <w:rPr>
+          <w:rFonts w:ascii="Times New Roman" w:cs="Times New Roman" w:eastAsia="Times New Roman" w:hAnsi="Times New Roman"/>
+          <w:b w:val="1"/>
+          <w:bCs w:val="1"/>
+          <w:i w:val="1"/>
+          <w:iCs w:val="1"/>
+          <w:sz w:val="26"/>
+          <w:szCs w:val="26"/>
+        </w:rPr>
+      </w:pPr>
+      <w:r>
+        <w:rPr>
+          <w:rtl w:val="0"/>
+        </w:rPr>
+      </w:r>
+    </w:p>
+    <w:p>
+      <w:pPr>
+        <w:numPr>
+          <w:ilvl w:val="2"/>
+          <w:numId w:val="2"/>
+        </w:numPr>
+        <w:spacing w:after="0" w:lineRule="auto"/>
+        <w:ind w:left="1800" w:hanging="720"/>
+        <w:rPr>
+          <w:rFonts w:ascii="Times New Roman" w:cs="Times New Roman" w:eastAsia="Times New Roman" w:hAnsi="Times New Roman"/>
+          <w:b w:val="1"/>
+          <w:bCs w:val="1"/>
+          <w:i w:val="1"/>
+          <w:iCs w:val="1"/>
+          <w:sz w:val="26"/>
+          <w:szCs w:val="26"/>
+        </w:rPr>
+      </w:pPr>
+      <w:r>
+        <w:rPr>
+          <w:rFonts w:ascii="Times New Roman" w:cs="Times New Roman" w:eastAsia="Times New Roman" w:hAnsi="Times New Roman"/>
+          <w:b w:val="1"/>
+          <w:bCs w:val="1"/>
+          <w:i w:val="1"/>
+          <w:iCs w:val="1"/>
+          <w:sz w:val="26"/>
+          <w:szCs w:val="26"/>
+          <w:rtl w:val="0"/>
+        </w:rPr>
+        <w:t xml:space="preserve">Phân tích quy trình</w:t>
       </w:r>
     </w:p>
     <w:p>
@@ -1848,18 +2635,137 @@
         <w:ind w:left="1440" w:hanging="360"/>
         <w:rPr>
           <w:rFonts w:ascii="Times New Roman" w:cs="Times New Roman" w:eastAsia="Times New Roman" w:hAnsi="Times New Roman"/>
-          <w:sz w:val="26"/>
-          <w:szCs w:val="26"/>
-        </w:rPr>
-      </w:pPr>
-      <w:r>
-        <w:rPr>
-          <w:rFonts w:ascii="Times New Roman" w:cs="Times New Roman" w:eastAsia="Times New Roman" w:hAnsi="Times New Roman"/>
-          <w:sz w:val="26"/>
-          <w:szCs w:val="26"/>
-          <w:rtl w:val="0"/>
-        </w:rPr>
-        <w:t xml:space="preserve">Phát hành đơn đặt hàng: Phòng mua hàng tạo đơn đặt hàng trên hệ thống và gửi cho nhà cung cấp</w:t>
+          <w:b w:val="1"/>
+          <w:bCs w:val="1"/>
+          <w:sz w:val="26"/>
+          <w:szCs w:val="26"/>
+        </w:rPr>
+      </w:pPr>
+      <w:r>
+        <w:rPr>
+          <w:rFonts w:ascii="Times New Roman" w:cs="Times New Roman" w:eastAsia="Times New Roman" w:hAnsi="Times New Roman"/>
+          <w:b w:val="1"/>
+          <w:bCs w:val="1"/>
+          <w:sz w:val="26"/>
+          <w:szCs w:val="26"/>
+          <w:rtl w:val="0"/>
+        </w:rPr>
+        <w:t xml:space="preserve">Các tác nhân tham gia quy trình</w:t>
+      </w:r>
+    </w:p>
+    <w:p>
+      <w:pPr>
+        <w:numPr>
+          <w:ilvl w:val="1"/>
+          <w:numId w:val="3"/>
+        </w:numPr>
+        <w:spacing w:after="0" w:lineRule="auto"/>
+        <w:ind w:left="2160" w:hanging="360"/>
+        <w:rPr>
+          <w:sz w:val="26"/>
+          <w:szCs w:val="26"/>
+        </w:rPr>
+      </w:pPr>
+      <w:r>
+        <w:rPr>
+          <w:rFonts w:ascii="Times New Roman" w:cs="Times New Roman" w:eastAsia="Times New Roman" w:hAnsi="Times New Roman"/>
+          <w:sz w:val="26"/>
+          <w:szCs w:val="26"/>
+          <w:rtl w:val="0"/>
+        </w:rPr>
+        <w:t xml:space="preserve">Ban quản lý chất lượng: đội ngũ thiết lập quy chuẩn vận hành và kiểm tra độc lập</w:t>
+      </w:r>
+      <w:r>
+        <w:rPr>
+          <w:rtl w:val="0"/>
+        </w:rPr>
+      </w:r>
+    </w:p>
+    <w:p>
+      <w:pPr>
+        <w:numPr>
+          <w:ilvl w:val="1"/>
+          <w:numId w:val="3"/>
+        </w:numPr>
+        <w:spacing w:after="0" w:lineRule="auto"/>
+        <w:ind w:left="2160" w:hanging="360"/>
+        <w:rPr>
+          <w:sz w:val="26"/>
+          <w:szCs w:val="26"/>
+          <w:u w:val="none"/>
+        </w:rPr>
+      </w:pPr>
+      <w:r>
+        <w:rPr>
+          <w:rFonts w:ascii="Times New Roman" w:cs="Times New Roman" w:eastAsia="Times New Roman" w:hAnsi="Times New Roman"/>
+          <w:sz w:val="26"/>
+          <w:szCs w:val="26"/>
+          <w:rtl w:val="0"/>
+        </w:rPr>
+        <w:t xml:space="preserve">Dược sĩ: người trực tiếp bán thuốc và bảo quản thuốc tại của hàng</w:t>
+      </w:r>
+      <w:r>
+        <w:rPr>
+          <w:rtl w:val="0"/>
+        </w:rPr>
+      </w:r>
+    </w:p>
+    <w:p>
+      <w:pPr>
+        <w:numPr>
+          <w:ilvl w:val="1"/>
+          <w:numId w:val="3"/>
+        </w:numPr>
+        <w:spacing w:after="0" w:lineRule="auto"/>
+        <w:ind w:left="2160" w:hanging="360"/>
+        <w:rPr>
+          <w:sz w:val="26"/>
+          <w:szCs w:val="26"/>
+          <w:u w:val="none"/>
+        </w:rPr>
+      </w:pPr>
+      <w:r>
+        <w:rPr>
+          <w:rFonts w:ascii="Times New Roman" w:cs="Times New Roman" w:eastAsia="Times New Roman" w:hAnsi="Times New Roman"/>
+          <w:sz w:val="26"/>
+          <w:szCs w:val="26"/>
+          <w:rtl w:val="0"/>
+        </w:rPr>
+        <w:t xml:space="preserve">Phòng chăm sóc khách hàng: tiếp nhận thông tin khiếu nại của người dùng</w:t>
+      </w:r>
+      <w:r>
+        <w:rPr>
+          <w:rtl w:val="0"/>
+        </w:rPr>
+      </w:r>
+    </w:p>
+    <w:p>
+      <w:pPr>
+        <w:numPr>
+          <w:ilvl w:val="1"/>
+          <w:numId w:val="3"/>
+        </w:numPr>
+        <w:spacing w:after="0" w:lineRule="auto"/>
+        <w:ind w:left="2160" w:hanging="360"/>
+        <w:rPr>
+          <w:sz w:val="26"/>
+          <w:szCs w:val="26"/>
+          <w:u w:val="none"/>
+        </w:rPr>
+      </w:pPr>
+      <w:r>
+        <w:rPr>
+          <w:rFonts w:ascii="Times New Roman" w:cs="Times New Roman" w:eastAsia="Times New Roman" w:hAnsi="Times New Roman"/>
+          <w:sz w:val="26"/>
+          <w:szCs w:val="26"/>
+          <w:rtl w:val="0"/>
+        </w:rPr>
+        <w:t xml:space="preserve">Cơ quan quản lý nhà nước: sở y tế và cơ quan quản lý thị trường có trách nhiệm thanh tra, kiểm tra xử lý vi phạm của nhà thuốc nếu có</w:t>
+      </w:r>
+      <w:r>
+        <w:rPr>
+          <w:rtl w:val="0"/>
+        </w:rPr>
       </w:r>
     </w:p>
     <w:p>
@@ -1872,18 +2778,79 @@
         <w:ind w:left="1440" w:hanging="360"/>
         <w:rPr>
           <w:rFonts w:ascii="Times New Roman" w:cs="Times New Roman" w:eastAsia="Times New Roman" w:hAnsi="Times New Roman"/>
-          <w:sz w:val="26"/>
-          <w:szCs w:val="26"/>
-        </w:rPr>
-      </w:pPr>
-      <w:r>
-        <w:rPr>
-          <w:rFonts w:ascii="Times New Roman" w:cs="Times New Roman" w:eastAsia="Times New Roman" w:hAnsi="Times New Roman"/>
-          <w:sz w:val="26"/>
-          <w:szCs w:val="26"/>
-          <w:rtl w:val="0"/>
-        </w:rPr>
-        <w:t xml:space="preserve">Giao nhận và kiểm tra chất lượng: nhà cung cấp giao hàng tới kho hàng trung tâm, nhân viên kho kiểm tra: số lượng, chất lượng, hạn sử dụng sản phẩm và điều kiện bảo quản thực tế khi giao hàng</w:t>
+          <w:b w:val="1"/>
+          <w:bCs w:val="1"/>
+          <w:sz w:val="26"/>
+          <w:szCs w:val="26"/>
+        </w:rPr>
+      </w:pPr>
+      <w:r>
+        <w:rPr>
+          <w:rFonts w:ascii="Times New Roman" w:cs="Times New Roman" w:eastAsia="Times New Roman" w:hAnsi="Times New Roman"/>
+          <w:b w:val="1"/>
+          <w:bCs w:val="1"/>
+          <w:sz w:val="26"/>
+          <w:szCs w:val="26"/>
+          <w:rtl w:val="0"/>
+        </w:rPr>
+        <w:t xml:space="preserve">Khách hàng của quy trình này</w:t>
+      </w:r>
+    </w:p>
+    <w:p>
+      <w:pPr>
+        <w:numPr>
+          <w:ilvl w:val="1"/>
+          <w:numId w:val="3"/>
+        </w:numPr>
+        <w:spacing w:after="0" w:lineRule="auto"/>
+        <w:ind w:left="2160" w:hanging="360"/>
+        <w:rPr>
+          <w:sz w:val="26"/>
+          <w:szCs w:val="26"/>
+        </w:rPr>
+      </w:pPr>
+      <w:r>
+        <w:rPr>
+          <w:rFonts w:ascii="Times New Roman" w:cs="Times New Roman" w:eastAsia="Times New Roman" w:hAnsi="Times New Roman"/>
+          <w:sz w:val="26"/>
+          <w:szCs w:val="26"/>
+          <w:rtl w:val="0"/>
+        </w:rPr>
+        <w:t xml:space="preserve">Khách hàng bên ngoài: người tiêu dùng chính là khách hàng cho quy trình này vì nó giúp người tiêu dùng mua được sản phẩm tốt nhất, không bị lỗi hoặc hết hạn</w:t>
+      </w:r>
+      <w:r>
+        <w:rPr>
+          <w:rtl w:val="0"/>
+        </w:rPr>
+      </w:r>
+    </w:p>
+    <w:p>
+      <w:pPr>
+        <w:numPr>
+          <w:ilvl w:val="1"/>
+          <w:numId w:val="3"/>
+        </w:numPr>
+        <w:spacing w:after="0" w:lineRule="auto"/>
+        <w:ind w:left="2160" w:hanging="360"/>
+        <w:rPr>
+          <w:sz w:val="26"/>
+          <w:szCs w:val="26"/>
+          <w:u w:val="none"/>
+        </w:rPr>
+      </w:pPr>
+      <w:r>
+        <w:rPr>
+          <w:rFonts w:ascii="Times New Roman" w:cs="Times New Roman" w:eastAsia="Times New Roman" w:hAnsi="Times New Roman"/>
+          <w:sz w:val="26"/>
+          <w:szCs w:val="26"/>
+          <w:rtl w:val="0"/>
+        </w:rPr>
+        <w:t xml:space="preserve">Khách hàng nội bộ: ban giám đốc công ty (quy trình giúp bảo vệ uy tín thương hiệu và tránh pháp lý liên quan)</w:t>
+      </w:r>
+      <w:r>
+        <w:rPr>
+          <w:rtl w:val="0"/>
+        </w:rPr>
       </w:r>
     </w:p>
     <w:p>
@@ -1896,1001 +2863,123 @@
         <w:ind w:left="1440" w:hanging="360"/>
         <w:rPr>
           <w:rFonts w:ascii="Times New Roman" w:cs="Times New Roman" w:eastAsia="Times New Roman" w:hAnsi="Times New Roman"/>
-          <w:sz w:val="26"/>
-          <w:szCs w:val="26"/>
-        </w:rPr>
-      </w:pPr>
-      <w:r>
-        <w:rPr>
-          <w:rFonts w:ascii="Times New Roman" w:cs="Times New Roman" w:eastAsia="Times New Roman" w:hAnsi="Times New Roman"/>
-          <w:sz w:val="26"/>
-          <w:szCs w:val="26"/>
-          <w:rtl w:val="0"/>
-        </w:rPr>
-        <w:t xml:space="preserve">Lưu kho và phân phối: cập nhật số lượng vào hệ thống phần mềm, sau đó cho nhập kho hoặc có thể phân phối trực tiếp ra các nhà thuốc trên toàn quốc</w:t>
-      </w:r>
-    </w:p>
-    <w:p>
-      <w:pPr>
-        <w:numPr>
-          <w:ilvl w:val="0"/>
-          <w:numId w:val="4"/>
-        </w:numPr>
-        <w:spacing w:after="0" w:lineRule="auto"/>
-        <w:ind w:left="1440" w:hanging="360"/>
-        <w:rPr>
-          <w:rFonts w:ascii="Times New Roman" w:cs="Times New Roman" w:eastAsia="Times New Roman" w:hAnsi="Times New Roman"/>
-          <w:sz w:val="26"/>
-          <w:szCs w:val="26"/>
-        </w:rPr>
-      </w:pPr>
-      <w:r>
-        <w:rPr>
-          <w:rFonts w:ascii="Times New Roman" w:cs="Times New Roman" w:eastAsia="Times New Roman" w:hAnsi="Times New Roman"/>
-          <w:sz w:val="26"/>
-          <w:szCs w:val="26"/>
-          <w:rtl w:val="0"/>
-        </w:rPr>
-        <w:t xml:space="preserve">Thanh toán cho nhà cung cấp: Kế toán đối chiếu dữ liệu nhập khi thực tế và hóa đơn của nhà cung cấp, nếu khớp bắt đầu thành toán cho nhà cung cấp.</w:t>
+          <w:b w:val="1"/>
+          <w:bCs w:val="1"/>
+          <w:sz w:val="26"/>
+          <w:szCs w:val="26"/>
+        </w:rPr>
+      </w:pPr>
+      <w:r>
+        <w:rPr>
+          <w:rFonts w:ascii="Times New Roman" w:cs="Times New Roman" w:eastAsia="Times New Roman" w:hAnsi="Times New Roman"/>
+          <w:b w:val="1"/>
+          <w:bCs w:val="1"/>
+          <w:sz w:val="26"/>
+          <w:szCs w:val="26"/>
+          <w:rtl w:val="0"/>
+        </w:rPr>
+        <w:t xml:space="preserve">Những khả năng kết quả của quy trình</w:t>
+      </w:r>
+    </w:p>
+    <w:p>
+      <w:pPr>
+        <w:numPr>
+          <w:ilvl w:val="1"/>
+          <w:numId w:val="3"/>
+        </w:numPr>
+        <w:spacing w:after="0" w:lineRule="auto"/>
+        <w:ind w:left="2160" w:hanging="360"/>
+        <w:rPr>
+          <w:sz w:val="26"/>
+          <w:szCs w:val="26"/>
+        </w:rPr>
+      </w:pPr>
+      <w:r>
+        <w:rPr>
+          <w:rFonts w:ascii="Times New Roman" w:cs="Times New Roman" w:eastAsia="Times New Roman" w:hAnsi="Times New Roman"/>
+          <w:sz w:val="26"/>
+          <w:szCs w:val="26"/>
+          <w:rtl w:val="0"/>
+        </w:rPr>
+        <w:t xml:space="preserve">Kết quả tích cực: Ngăn chặn kịp thời thuốc kém chất lượng ra thị trường; hệ thống đạt 100% chuẩn quy định trong các kỳ thanh tra, sự cố được xử lý nhanh gọn mà không ảnh hưởng đến truyền thông.</w:t>
+      </w:r>
+      <w:r>
+        <w:rPr>
+          <w:rtl w:val="0"/>
+        </w:rPr>
+      </w:r>
+    </w:p>
+    <w:p>
+      <w:pPr>
+        <w:numPr>
+          <w:ilvl w:val="1"/>
+          <w:numId w:val="3"/>
+        </w:numPr>
+        <w:spacing w:after="0" w:lineRule="auto"/>
+        <w:ind w:left="2160" w:hanging="360"/>
+        <w:rPr>
+          <w:sz w:val="26"/>
+          <w:szCs w:val="26"/>
+          <w:u w:val="none"/>
+        </w:rPr>
+      </w:pPr>
+      <w:r>
+        <w:rPr>
+          <w:rFonts w:ascii="Times New Roman" w:cs="Times New Roman" w:eastAsia="Times New Roman" w:hAnsi="Times New Roman"/>
+          <w:sz w:val="26"/>
+          <w:szCs w:val="26"/>
+          <w:rtl w:val="0"/>
+        </w:rPr>
+        <w:t xml:space="preserve">Kết quả tiêu cực:</w:t>
+      </w:r>
+      <w:r>
+        <w:rPr>
+          <w:rtl w:val="0"/>
+        </w:rPr>
       </w:r>
     </w:p>
     <w:p>
       <w:pPr>
         <w:numPr>
           <w:ilvl w:val="2"/>
-          <w:numId w:val="1"/>
-        </w:numPr>
-        <w:spacing w:after="0" w:lineRule="auto"/>
-        <w:ind w:left="1800" w:hanging="720"/>
-        <w:rPr>
-          <w:rFonts w:ascii="Times New Roman" w:cs="Times New Roman" w:eastAsia="Times New Roman" w:hAnsi="Times New Roman"/>
-          <w:b w:val="1"/>
-          <w:bCs w:val="1"/>
-          <w:i w:val="1"/>
-          <w:iCs w:val="1"/>
-          <w:sz w:val="26"/>
-          <w:szCs w:val="26"/>
-        </w:rPr>
-      </w:pPr>
-      <w:r>
-        <w:rPr>
-          <w:rFonts w:ascii="Times New Roman" w:cs="Times New Roman" w:eastAsia="Times New Roman" w:hAnsi="Times New Roman"/>
-          <w:b w:val="1"/>
-          <w:bCs w:val="1"/>
-          <w:i w:val="1"/>
-          <w:iCs w:val="1"/>
-          <w:sz w:val="26"/>
-          <w:szCs w:val="26"/>
-          <w:rtl w:val="0"/>
-        </w:rPr>
-        <w:t xml:space="preserve">Phân tích quy trình</w:t>
-      </w:r>
-    </w:p>
-    <w:p>
-      <w:pPr>
-        <w:numPr>
-          <w:ilvl w:val="0"/>
-          <w:numId w:val="5"/>
-        </w:numPr>
-        <w:spacing w:after="0" w:lineRule="auto"/>
-        <w:ind w:left="1440" w:hanging="360"/>
-        <w:rPr>
-          <w:rFonts w:ascii="Times New Roman" w:cs="Times New Roman" w:eastAsia="Times New Roman" w:hAnsi="Times New Roman"/>
-          <w:b w:val="1"/>
-          <w:bCs w:val="1"/>
-          <w:sz w:val="26"/>
-          <w:szCs w:val="26"/>
-        </w:rPr>
-      </w:pPr>
-      <w:r>
-        <w:rPr>
-          <w:rFonts w:ascii="Times New Roman" w:cs="Times New Roman" w:eastAsia="Times New Roman" w:hAnsi="Times New Roman"/>
-          <w:b w:val="1"/>
-          <w:bCs w:val="1"/>
-          <w:sz w:val="26"/>
-          <w:szCs w:val="26"/>
-          <w:rtl w:val="0"/>
-        </w:rPr>
-        <w:t xml:space="preserve">Các tác nhân tham gia quy trình</w:t>
-      </w:r>
-    </w:p>
-    <w:p>
-      <w:pPr>
-        <w:numPr>
-          <w:ilvl w:val="1"/>
-          <w:numId w:val="2"/>
-        </w:numPr>
-        <w:spacing w:after="0" w:lineRule="auto"/>
-        <w:ind w:left="2160" w:hanging="360"/>
-        <w:rPr>
-          <w:sz w:val="26"/>
-          <w:szCs w:val="26"/>
-        </w:rPr>
-      </w:pPr>
-      <w:r>
-        <w:rPr>
-          <w:rFonts w:ascii="Times New Roman" w:cs="Times New Roman" w:eastAsia="Times New Roman" w:hAnsi="Times New Roman"/>
-          <w:sz w:val="26"/>
-          <w:szCs w:val="26"/>
-          <w:rtl w:val="0"/>
-        </w:rPr>
-        <w:t xml:space="preserve">Phòng kế hoạch: dự báo nhu cầu thuốc dựa trên lịch sử bán hàng và dịch bệnh gần đây lên kế hoạch mua hàng</w:t>
-      </w:r>
-    </w:p>
-    <w:p>
-      <w:pPr>
-        <w:numPr>
-          <w:ilvl w:val="1"/>
-          <w:numId w:val="2"/>
-        </w:numPr>
-        <w:spacing w:after="0" w:lineRule="auto"/>
-        <w:ind w:left="2160" w:hanging="360"/>
-        <w:rPr>
-          <w:rFonts w:ascii="Times New Roman" w:cs="Times New Roman" w:eastAsia="Times New Roman" w:hAnsi="Times New Roman"/>
-          <w:sz w:val="26"/>
-          <w:szCs w:val="26"/>
-        </w:rPr>
-      </w:pPr>
-      <w:r>
-        <w:rPr>
-          <w:rFonts w:ascii="Times New Roman" w:cs="Times New Roman" w:eastAsia="Times New Roman" w:hAnsi="Times New Roman"/>
-          <w:sz w:val="26"/>
-          <w:szCs w:val="26"/>
-          <w:rtl w:val="0"/>
-        </w:rPr>
-        <w:t xml:space="preserve">Phòng mua hàng: tìm kiếm, đánh giá và chốt hợp đồng với nhà cung cấp thuốc và vật tư y tế</w:t>
-      </w:r>
-    </w:p>
-    <w:p>
-      <w:pPr>
-        <w:numPr>
-          <w:ilvl w:val="1"/>
-          <w:numId w:val="2"/>
-        </w:numPr>
-        <w:spacing w:after="0" w:lineRule="auto"/>
-        <w:ind w:left="2160" w:hanging="360"/>
-        <w:rPr>
-          <w:rFonts w:ascii="Times New Roman" w:cs="Times New Roman" w:eastAsia="Times New Roman" w:hAnsi="Times New Roman"/>
-          <w:sz w:val="26"/>
-          <w:szCs w:val="26"/>
-        </w:rPr>
-      </w:pPr>
-      <w:r>
-        <w:rPr>
-          <w:rFonts w:ascii="Times New Roman" w:cs="Times New Roman" w:eastAsia="Times New Roman" w:hAnsi="Times New Roman"/>
-          <w:sz w:val="26"/>
-          <w:szCs w:val="26"/>
-          <w:rtl w:val="0"/>
-        </w:rPr>
-        <w:t xml:space="preserve">Nhà cung cấp: các công ty dược phẩm, các nhà cung cấp vật tư y tế</w:t>
-      </w:r>
-    </w:p>
-    <w:p>
-      <w:pPr>
-        <w:numPr>
-          <w:ilvl w:val="1"/>
-          <w:numId w:val="2"/>
-        </w:numPr>
-        <w:spacing w:after="0" w:lineRule="auto"/>
-        <w:ind w:left="2160" w:hanging="360"/>
-        <w:rPr>
-          <w:rFonts w:ascii="Times New Roman" w:cs="Times New Roman" w:eastAsia="Times New Roman" w:hAnsi="Times New Roman"/>
-          <w:sz w:val="26"/>
-          <w:szCs w:val="26"/>
-        </w:rPr>
-      </w:pPr>
-      <w:r>
-        <w:rPr>
-          <w:rFonts w:ascii="Times New Roman" w:cs="Times New Roman" w:eastAsia="Times New Roman" w:hAnsi="Times New Roman"/>
-          <w:sz w:val="26"/>
-          <w:szCs w:val="26"/>
-          <w:rtl w:val="0"/>
-        </w:rPr>
-        <w:t xml:space="preserve">Kho hàng trung tâm: nhận hàng, kiểm tra và bảo quản</w:t>
-      </w:r>
-    </w:p>
-    <w:p>
-      <w:pPr>
-        <w:numPr>
-          <w:ilvl w:val="1"/>
-          <w:numId w:val="2"/>
-        </w:numPr>
-        <w:spacing w:after="0" w:lineRule="auto"/>
-        <w:ind w:left="2160" w:hanging="360"/>
-        <w:rPr>
-          <w:rFonts w:ascii="Times New Roman" w:cs="Times New Roman" w:eastAsia="Times New Roman" w:hAnsi="Times New Roman"/>
-          <w:sz w:val="26"/>
-          <w:szCs w:val="26"/>
-        </w:rPr>
-      </w:pPr>
-      <w:r>
-        <w:rPr>
-          <w:rFonts w:ascii="Times New Roman" w:cs="Times New Roman" w:eastAsia="Times New Roman" w:hAnsi="Times New Roman"/>
-          <w:sz w:val="26"/>
-          <w:szCs w:val="26"/>
-          <w:rtl w:val="0"/>
-        </w:rPr>
-        <w:t xml:space="preserve">Phòng kế toán: nhận hóa đơn và thanh toán cho nhà cung cấp</w:t>
-      </w:r>
-    </w:p>
-    <w:p>
-      <w:pPr>
-        <w:numPr>
-          <w:ilvl w:val="1"/>
-          <w:numId w:val="2"/>
-        </w:numPr>
-        <w:spacing w:after="0" w:lineRule="auto"/>
-        <w:ind w:left="2160" w:hanging="360"/>
-        <w:rPr>
-          <w:rFonts w:ascii="Times New Roman" w:cs="Times New Roman" w:eastAsia="Times New Roman" w:hAnsi="Times New Roman"/>
-          <w:sz w:val="26"/>
-          <w:szCs w:val="26"/>
-        </w:rPr>
-      </w:pPr>
-      <w:r>
-        <w:rPr>
-          <w:rFonts w:ascii="Times New Roman" w:cs="Times New Roman" w:eastAsia="Times New Roman" w:hAnsi="Times New Roman"/>
-          <w:sz w:val="26"/>
-          <w:szCs w:val="26"/>
-          <w:rtl w:val="0"/>
-        </w:rPr>
-        <w:t xml:space="preserve">Quản lý của nhà thuốc: người tiếp nhận thuốc tại chi nhánh bán lẻ</w:t>
-      </w:r>
-    </w:p>
-    <w:p>
-      <w:pPr>
-        <w:numPr>
-          <w:ilvl w:val="0"/>
-          <w:numId w:val="5"/>
-        </w:numPr>
-        <w:spacing w:after="0" w:lineRule="auto"/>
-        <w:ind w:left="1440" w:hanging="360"/>
-        <w:rPr>
-          <w:rFonts w:ascii="Times New Roman" w:cs="Times New Roman" w:eastAsia="Times New Roman" w:hAnsi="Times New Roman"/>
-          <w:b w:val="1"/>
-          <w:bCs w:val="1"/>
-          <w:sz w:val="26"/>
-          <w:szCs w:val="26"/>
-        </w:rPr>
-      </w:pPr>
-      <w:r>
-        <w:rPr>
-          <w:rFonts w:ascii="Times New Roman" w:cs="Times New Roman" w:eastAsia="Times New Roman" w:hAnsi="Times New Roman"/>
-          <w:b w:val="1"/>
-          <w:bCs w:val="1"/>
-          <w:sz w:val="26"/>
-          <w:szCs w:val="26"/>
-          <w:rtl w:val="0"/>
-        </w:rPr>
-        <w:t xml:space="preserve">Khách hàng của quy trình này</w:t>
-      </w:r>
-    </w:p>
-    <w:p>
-      <w:pPr>
-        <w:numPr>
-          <w:ilvl w:val="1"/>
-          <w:numId w:val="2"/>
-        </w:numPr>
-        <w:spacing w:after="0" w:lineRule="auto"/>
-        <w:ind w:left="2160" w:hanging="360"/>
-        <w:rPr>
-          <w:sz w:val="26"/>
-          <w:szCs w:val="26"/>
-        </w:rPr>
-      </w:pPr>
-      <w:r>
-        <w:rPr>
-          <w:rFonts w:ascii="Times New Roman" w:cs="Times New Roman" w:eastAsia="Times New Roman" w:hAnsi="Times New Roman"/>
-          <w:sz w:val="26"/>
-          <w:szCs w:val="26"/>
-          <w:rtl w:val="0"/>
-        </w:rPr>
-        <w:t xml:space="preserve">Khách hàng của quy trình chính là các chi nhánh nhà thuốc, vì họ cần quy trình này để có đủ thuốc với chất lượng tốt và đúng thời điểm để bán ra cho người mua hàng, và cũng chính là đối tượng hưởng lợi từ quy trình.</w:t>
-      </w:r>
-    </w:p>
-    <w:p>
-      <w:pPr>
-        <w:numPr>
-          <w:ilvl w:val="0"/>
-          <w:numId w:val="5"/>
-        </w:numPr>
-        <w:spacing w:after="0" w:lineRule="auto"/>
-        <w:ind w:left="1440" w:hanging="360"/>
-        <w:rPr>
-          <w:rFonts w:ascii="Times New Roman" w:cs="Times New Roman" w:eastAsia="Times New Roman" w:hAnsi="Times New Roman"/>
-          <w:b w:val="1"/>
-          <w:bCs w:val="1"/>
-          <w:sz w:val="26"/>
-          <w:szCs w:val="26"/>
-        </w:rPr>
-      </w:pPr>
-      <w:r>
-        <w:rPr>
-          <w:rFonts w:ascii="Times New Roman" w:cs="Times New Roman" w:eastAsia="Times New Roman" w:hAnsi="Times New Roman"/>
-          <w:b w:val="1"/>
-          <w:bCs w:val="1"/>
-          <w:sz w:val="26"/>
-          <w:szCs w:val="26"/>
-          <w:rtl w:val="0"/>
-        </w:rPr>
-        <w:t xml:space="preserve">Những khả năng kết quả của quy trình</w:t>
-      </w:r>
-    </w:p>
-    <w:p>
-      <w:pPr>
-        <w:numPr>
-          <w:ilvl w:val="1"/>
-          <w:numId w:val="2"/>
-        </w:numPr>
-        <w:spacing w:after="0" w:lineRule="auto"/>
-        <w:ind w:left="2160" w:hanging="360"/>
-        <w:rPr>
-          <w:sz w:val="26"/>
-          <w:szCs w:val="26"/>
-        </w:rPr>
-      </w:pPr>
-      <w:r>
-        <w:rPr>
-          <w:rFonts w:ascii="Times New Roman" w:cs="Times New Roman" w:eastAsia="Times New Roman" w:hAnsi="Times New Roman"/>
-          <w:sz w:val="26"/>
-          <w:szCs w:val="26"/>
-          <w:rtl w:val="0"/>
-        </w:rPr>
-        <w:t xml:space="preserve">Kết quả tích cực: Hàng hóa nhập kho đầy đủ, đúng tiêu chuẩn chất lượng, hạn sử dụng dài, chi phí tối ưu và kịp thời phân bổ về nhà thuốc.</w:t>
-      </w:r>
-    </w:p>
-    <w:p>
-      <w:pPr>
-        <w:numPr>
-          <w:ilvl w:val="1"/>
-          <w:numId w:val="2"/>
-        </w:numPr>
-        <w:spacing w:after="0" w:lineRule="auto"/>
-        <w:ind w:left="2160" w:hanging="360"/>
-        <w:rPr>
-          <w:rFonts w:ascii="Times New Roman" w:cs="Times New Roman" w:eastAsia="Times New Roman" w:hAnsi="Times New Roman"/>
-          <w:sz w:val="26"/>
-          <w:szCs w:val="26"/>
-        </w:rPr>
-      </w:pPr>
-      <w:r>
-        <w:rPr>
-          <w:rFonts w:ascii="Times New Roman" w:cs="Times New Roman" w:eastAsia="Times New Roman" w:hAnsi="Times New Roman"/>
-          <w:sz w:val="26"/>
-          <w:szCs w:val="26"/>
-          <w:rtl w:val="0"/>
-        </w:rPr>
-        <w:t xml:space="preserve">Kết quả tiêu cực</w:t>
+          <w:numId w:val="3"/>
+        </w:numPr>
+        <w:spacing w:after="0" w:lineRule="auto"/>
+        <w:ind w:left="2880" w:hanging="360"/>
+        <w:rPr>
+          <w:b w:val="1"/>
+          <w:bCs w:val="1"/>
+          <w:sz w:val="26"/>
+          <w:szCs w:val="26"/>
+        </w:rPr>
+      </w:pPr>
+      <w:r>
+        <w:rPr>
+          <w:rFonts w:ascii="Times New Roman" w:cs="Times New Roman" w:eastAsia="Times New Roman" w:hAnsi="Times New Roman"/>
+          <w:sz w:val="26"/>
+          <w:szCs w:val="26"/>
+          <w:rtl w:val="0"/>
+        </w:rPr>
+        <w:t xml:space="preserve">Thuốc lỗi hoặc hết hạn vô tình bán cho khách hàng dẫn tới khủng hoảng truyền thông</w:t>
+      </w:r>
+      <w:r>
+        <w:rPr>
+          <w:rtl w:val="0"/>
+        </w:rPr>
       </w:r>
     </w:p>
     <w:p>
       <w:pPr>
         <w:numPr>
           <w:ilvl w:val="2"/>
-          <w:numId w:val="2"/>
+          <w:numId w:val="3"/>
         </w:numPr>
         <w:spacing w:after="0" w:lineRule="auto"/>
         <w:ind w:left="2880" w:hanging="360"/>
         <w:rPr>
-          <w:rFonts w:ascii="Times New Roman" w:cs="Times New Roman" w:eastAsia="Times New Roman" w:hAnsi="Times New Roman"/>
-          <w:b w:val="1"/>
-          <w:bCs w:val="1"/>
-          <w:sz w:val="26"/>
-          <w:szCs w:val="26"/>
-        </w:rPr>
-      </w:pPr>
-      <w:r>
-        <w:rPr>
-          <w:rFonts w:ascii="Times New Roman" w:cs="Times New Roman" w:eastAsia="Times New Roman" w:hAnsi="Times New Roman"/>
-          <w:sz w:val="26"/>
-          <w:szCs w:val="26"/>
-          <w:rtl w:val="0"/>
-        </w:rPr>
-        <w:t xml:space="preserve">Hàng bị từ chối nhận tại kho do gần tới ngày hết hạn, móp méo hộp bao bì, hoặc không đạt chuẩn bảo quản nhiệt độ.</w:t>
-      </w:r>
-    </w:p>
-    <w:p>
-      <w:pPr>
-        <w:numPr>
-          <w:ilvl w:val="2"/>
-          <w:numId w:val="2"/>
-        </w:numPr>
-        <w:spacing w:after="0" w:lineRule="auto"/>
-        <w:ind w:left="2880" w:hanging="360"/>
-        <w:rPr>
-          <w:rFonts w:ascii="Times New Roman" w:cs="Times New Roman" w:eastAsia="Times New Roman" w:hAnsi="Times New Roman"/>
-          <w:sz w:val="26"/>
-          <w:szCs w:val="26"/>
-        </w:rPr>
-      </w:pPr>
-      <w:r>
-        <w:rPr>
-          <w:rFonts w:ascii="Times New Roman" w:cs="Times New Roman" w:eastAsia="Times New Roman" w:hAnsi="Times New Roman"/>
-          <w:sz w:val="26"/>
-          <w:szCs w:val="26"/>
-          <w:rtl w:val="0"/>
-        </w:rPr>
-        <w:t xml:space="preserve">Nhà cung cấp giao không đủ số lượng yêu cầu một số mặt hàng thiết yếu, dẫn đến tình trạng khan hiếm hàng tại các nhà thuốc.</w:t>
-      </w:r>
-    </w:p>
-    <w:p>
-      <w:pPr>
-        <w:numPr>
-          <w:ilvl w:val="1"/>
-          <w:numId w:val="1"/>
-        </w:numPr>
-        <w:spacing w:after="0" w:lineRule="auto"/>
-        <w:ind w:left="1092" w:hanging="372"/>
-        <w:rPr>
-          <w:rFonts w:ascii="Times New Roman" w:cs="Times New Roman" w:eastAsia="Times New Roman" w:hAnsi="Times New Roman"/>
-          <w:b w:val="1"/>
-          <w:bCs w:val="1"/>
-          <w:i w:val="1"/>
-          <w:iCs w:val="1"/>
-          <w:sz w:val="26"/>
-          <w:szCs w:val="26"/>
-        </w:rPr>
-      </w:pPr>
-      <w:r>
-        <w:rPr>
-          <w:rFonts w:ascii="Times New Roman" w:cs="Times New Roman" w:eastAsia="Times New Roman" w:hAnsi="Times New Roman"/>
-          <w:b w:val="1"/>
-          <w:bCs w:val="1"/>
-          <w:i w:val="1"/>
-          <w:iCs w:val="1"/>
-          <w:sz w:val="26"/>
-          <w:szCs w:val="26"/>
-          <w:rtl w:val="0"/>
-        </w:rPr>
-        <w:t xml:space="preserve">Quy trình quản lý chất lượng và xử lý rủi ro</w:t>
-      </w:r>
-    </w:p>
-    <w:p>
-      <w:pPr>
-        <w:numPr>
-          <w:ilvl w:val="2"/>
-          <w:numId w:val="1"/>
-        </w:numPr>
-        <w:spacing w:after="0" w:lineRule="auto"/>
-        <w:ind w:left="1800" w:hanging="720"/>
-        <w:rPr>
-          <w:rFonts w:ascii="Times New Roman" w:cs="Times New Roman" w:eastAsia="Times New Roman" w:hAnsi="Times New Roman"/>
-          <w:b w:val="1"/>
-          <w:bCs w:val="1"/>
-          <w:i w:val="1"/>
-          <w:iCs w:val="1"/>
-          <w:sz w:val="26"/>
-          <w:szCs w:val="26"/>
-        </w:rPr>
-      </w:pPr>
-      <w:r>
-        <w:rPr>
-          <w:rFonts w:ascii="Times New Roman" w:cs="Times New Roman" w:eastAsia="Times New Roman" w:hAnsi="Times New Roman"/>
-          <w:b w:val="1"/>
-          <w:bCs w:val="1"/>
-          <w:i w:val="1"/>
-          <w:iCs w:val="1"/>
-          <w:sz w:val="26"/>
-          <w:szCs w:val="26"/>
-          <w:rtl w:val="0"/>
-        </w:rPr>
-        <w:t xml:space="preserve">Phương pháp thực hiện</w:t>
-      </w:r>
-    </w:p>
-    <w:p>
-      <w:pPr>
-        <w:numPr>
-          <w:ilvl w:val="2"/>
-          <w:numId w:val="1"/>
-        </w:numPr>
-        <w:spacing w:after="0" w:lineRule="auto"/>
-        <w:ind w:left="1800" w:hanging="720"/>
-        <w:rPr>
-          <w:rFonts w:ascii="Times New Roman" w:cs="Times New Roman" w:eastAsia="Times New Roman" w:hAnsi="Times New Roman"/>
-          <w:b w:val="1"/>
-          <w:bCs w:val="1"/>
-          <w:i w:val="1"/>
-          <w:iCs w:val="1"/>
-          <w:sz w:val="26"/>
-          <w:szCs w:val="26"/>
-        </w:rPr>
-      </w:pPr>
-      <w:r>
-        <w:rPr>
-          <w:rFonts w:ascii="Times New Roman" w:cs="Times New Roman" w:eastAsia="Times New Roman" w:hAnsi="Times New Roman"/>
-          <w:b w:val="1"/>
-          <w:bCs w:val="1"/>
-          <w:i w:val="1"/>
-          <w:iCs w:val="1"/>
-          <w:sz w:val="26"/>
-          <w:szCs w:val="26"/>
-          <w:rtl w:val="0"/>
-        </w:rPr>
-        <w:t xml:space="preserve">Mô tả quy trình</w:t>
-      </w:r>
-    </w:p>
-    <w:p>
-      <w:pPr>
-        <w:numPr>
-          <w:ilvl w:val="0"/>
-          <w:numId w:val="4"/>
-        </w:numPr>
-        <w:spacing w:after="0" w:lineRule="auto"/>
-        <w:ind w:left="1440" w:hanging="360"/>
-        <w:rPr>
-          <w:rFonts w:ascii="Times New Roman" w:cs="Times New Roman" w:eastAsia="Times New Roman" w:hAnsi="Times New Roman"/>
-          <w:sz w:val="26"/>
-          <w:szCs w:val="26"/>
-        </w:rPr>
-      </w:pPr>
-      <w:r>
-        <w:rPr>
-          <w:rFonts w:ascii="Times New Roman" w:cs="Times New Roman" w:eastAsia="Times New Roman" w:hAnsi="Times New Roman"/>
-          <w:sz w:val="26"/>
-          <w:szCs w:val="26"/>
-          <w:rtl w:val="0"/>
-        </w:rPr>
-        <w:t xml:space="preserve">Xây dựng tiêu chuẩn chất lượng: ban quản lý chất lượng xây dựng các quy trình các thao tác chuẩn theo quy định của bộ y tế về bảo quản, tư vấn và bán thuốc</w:t>
-      </w:r>
-    </w:p>
-    <w:p>
-      <w:pPr>
-        <w:numPr>
-          <w:ilvl w:val="0"/>
-          <w:numId w:val="4"/>
-        </w:numPr>
-        <w:spacing w:after="0" w:lineRule="auto"/>
-        <w:ind w:left="1440" w:hanging="360"/>
-        <w:rPr>
-          <w:rFonts w:ascii="Times New Roman" w:cs="Times New Roman" w:eastAsia="Times New Roman" w:hAnsi="Times New Roman"/>
-          <w:sz w:val="26"/>
-          <w:szCs w:val="26"/>
-        </w:rPr>
-      </w:pPr>
-      <w:r>
-        <w:rPr>
-          <w:rFonts w:ascii="Times New Roman" w:cs="Times New Roman" w:eastAsia="Times New Roman" w:hAnsi="Times New Roman"/>
-          <w:sz w:val="26"/>
-          <w:szCs w:val="26"/>
-          <w:rtl w:val="0"/>
-        </w:rPr>
-        <w:t xml:space="preserve">Giám sát và kiểm tra định kỳ: ban quản lý sẽ cử các đội kiểm tra định kỳ hoặc đột xuất tại kho hàng trung tâm và các nhà thuốc (hạn sử dụng thuốc trên kệ gần hết hạn chưa, nhiệt độ để bảo quản thuốc đủ chưa, nhiệt độ tủ lạnh để bảo quản vắc xin…)</w:t>
-      </w:r>
-    </w:p>
-    <w:p>
-      <w:pPr>
-        <w:numPr>
-          <w:ilvl w:val="0"/>
-          <w:numId w:val="4"/>
-        </w:numPr>
-        <w:spacing w:after="0" w:lineRule="auto"/>
-        <w:ind w:left="1440" w:hanging="360"/>
-        <w:rPr>
-          <w:rFonts w:ascii="Times New Roman" w:cs="Times New Roman" w:eastAsia="Times New Roman" w:hAnsi="Times New Roman"/>
-          <w:sz w:val="26"/>
-          <w:szCs w:val="26"/>
-        </w:rPr>
-      </w:pPr>
-      <w:r>
-        <w:rPr>
-          <w:rFonts w:ascii="Times New Roman" w:cs="Times New Roman" w:eastAsia="Times New Roman" w:hAnsi="Times New Roman"/>
-          <w:sz w:val="26"/>
-          <w:szCs w:val="26"/>
-          <w:rtl w:val="0"/>
-        </w:rPr>
-        <w:t xml:space="preserve">Ghi nhận rủi ro và sự cố: ghi nhận thông tin trong quá trình kiểm tra nếu thuốc sắp hết hạn mà chưa được hạ kệ, khiếu nại từ khách hàng về chất lượng sản phẩm, hoặc thông báo thu hồi thuốc từ cơ quan quản lý nhà nước</w:t>
-      </w:r>
-    </w:p>
-    <w:p>
-      <w:pPr>
-        <w:numPr>
-          <w:ilvl w:val="0"/>
-          <w:numId w:val="4"/>
-        </w:numPr>
-        <w:spacing w:after="0" w:lineRule="auto"/>
-        <w:ind w:left="1440" w:hanging="360"/>
-        <w:rPr>
-          <w:rFonts w:ascii="Times New Roman" w:cs="Times New Roman" w:eastAsia="Times New Roman" w:hAnsi="Times New Roman"/>
-          <w:sz w:val="26"/>
-          <w:szCs w:val="26"/>
-        </w:rPr>
-      </w:pPr>
-      <w:r>
-        <w:rPr>
-          <w:rFonts w:ascii="Times New Roman" w:cs="Times New Roman" w:eastAsia="Times New Roman" w:hAnsi="Times New Roman"/>
-          <w:sz w:val="26"/>
-          <w:szCs w:val="26"/>
-          <w:rtl w:val="0"/>
-        </w:rPr>
-        <w:t xml:space="preserve">Thu hồi sản phẩm và xử lý: khóa sản phẩm bị lỗi hoặc sắp hết hạn trên hệ thống không được bán tiếp, và đưa sản phẩm vào kho cách biệt với các sản phẩm khác. Ban quản lý chất lượng tiến hành điều tra nguyên nhân để xử lý</w:t>
-      </w:r>
-    </w:p>
-    <w:p>
-      <w:pPr>
-        <w:numPr>
-          <w:ilvl w:val="0"/>
-          <w:numId w:val="4"/>
-        </w:numPr>
-        <w:spacing w:after="0" w:lineRule="auto"/>
-        <w:ind w:left="1440" w:hanging="360"/>
-        <w:rPr>
-          <w:rFonts w:ascii="Times New Roman" w:cs="Times New Roman" w:eastAsia="Times New Roman" w:hAnsi="Times New Roman"/>
-          <w:sz w:val="26"/>
-          <w:szCs w:val="26"/>
-        </w:rPr>
-      </w:pPr>
-      <w:r>
-        <w:rPr>
-          <w:rFonts w:ascii="Times New Roman" w:cs="Times New Roman" w:eastAsia="Times New Roman" w:hAnsi="Times New Roman"/>
-          <w:sz w:val="26"/>
-          <w:szCs w:val="26"/>
-          <w:rtl w:val="0"/>
-        </w:rPr>
-        <w:t xml:space="preserve">Khắc phục và cải tiến: Trả lại hàng bị lỗi cho nhà cung cấp hoặc đem đi tiêu hủy an toàn. Phổ biến lỗi, đào tạo lại dược sĩ và cập nhật quy trình để tránh lặp lại sai lầm tương tự</w:t>
-      </w:r>
-    </w:p>
-    <w:p>
-      <w:pPr>
-        <w:spacing w:after="0" w:lineRule="auto"/>
-        <w:rPr>
-          <w:rFonts w:ascii="Times New Roman" w:cs="Times New Roman" w:eastAsia="Times New Roman" w:hAnsi="Times New Roman"/>
-          <w:b w:val="1"/>
-          <w:bCs w:val="1"/>
-          <w:i w:val="1"/>
-          <w:iCs w:val="1"/>
-          <w:sz w:val="26"/>
-          <w:szCs w:val="26"/>
-        </w:rPr>
-      </w:pPr>
-      <w:r>
-        <w:rPr>
-          <w:rtl w:val="0"/>
-        </w:rPr>
-      </w:r>
-    </w:p>
-    <w:p>
-      <w:pPr>
-        <w:numPr>
-          <w:ilvl w:val="2"/>
-          <w:numId w:val="1"/>
-        </w:numPr>
-        <w:spacing w:after="0" w:lineRule="auto"/>
-        <w:ind w:left="1800" w:hanging="720"/>
-        <w:rPr>
-          <w:rFonts w:ascii="Times New Roman" w:cs="Times New Roman" w:eastAsia="Times New Roman" w:hAnsi="Times New Roman"/>
-          <w:b w:val="1"/>
-          <w:bCs w:val="1"/>
-          <w:i w:val="1"/>
-          <w:iCs w:val="1"/>
-          <w:sz w:val="26"/>
-          <w:szCs w:val="26"/>
-        </w:rPr>
-      </w:pPr>
-      <w:r>
-        <w:rPr>
-          <w:rFonts w:ascii="Times New Roman" w:cs="Times New Roman" w:eastAsia="Times New Roman" w:hAnsi="Times New Roman"/>
-          <w:b w:val="1"/>
-          <w:bCs w:val="1"/>
-          <w:i w:val="1"/>
-          <w:iCs w:val="1"/>
-          <w:sz w:val="26"/>
-          <w:szCs w:val="26"/>
-          <w:rtl w:val="0"/>
-        </w:rPr>
-        <w:t xml:space="preserve">Phân tích quy trình</w:t>
-      </w:r>
-    </w:p>
-    <w:p>
-      <w:pPr>
-        <w:numPr>
-          <w:ilvl w:val="0"/>
-          <w:numId w:val="5"/>
-        </w:numPr>
-        <w:spacing w:after="0" w:lineRule="auto"/>
-        <w:ind w:left="1440" w:hanging="360"/>
-        <w:rPr>
-          <w:rFonts w:ascii="Times New Roman" w:cs="Times New Roman" w:eastAsia="Times New Roman" w:hAnsi="Times New Roman"/>
-          <w:b w:val="1"/>
-          <w:bCs w:val="1"/>
-          <w:sz w:val="26"/>
-          <w:szCs w:val="26"/>
-        </w:rPr>
-      </w:pPr>
-      <w:r>
-        <w:rPr>
-          <w:rFonts w:ascii="Times New Roman" w:cs="Times New Roman" w:eastAsia="Times New Roman" w:hAnsi="Times New Roman"/>
-          <w:b w:val="1"/>
-          <w:bCs w:val="1"/>
-          <w:sz w:val="26"/>
-          <w:szCs w:val="26"/>
-          <w:rtl w:val="0"/>
-        </w:rPr>
-        <w:t xml:space="preserve">Các tác nhân tham gia quy trình</w:t>
-      </w:r>
-    </w:p>
-    <w:p>
-      <w:pPr>
-        <w:numPr>
-          <w:ilvl w:val="1"/>
-          <w:numId w:val="2"/>
-        </w:numPr>
-        <w:spacing w:after="0" w:lineRule="auto"/>
-        <w:ind w:left="2160" w:hanging="360"/>
-        <w:rPr>
-          <w:sz w:val="26"/>
-          <w:szCs w:val="26"/>
-        </w:rPr>
-      </w:pPr>
-      <w:r>
-        <w:rPr>
-          <w:rFonts w:ascii="Times New Roman" w:cs="Times New Roman" w:eastAsia="Times New Roman" w:hAnsi="Times New Roman"/>
-          <w:sz w:val="26"/>
-          <w:szCs w:val="26"/>
-          <w:rtl w:val="0"/>
-        </w:rPr>
-        <w:t xml:space="preserve">Ban quản lý chất lượng: đội ngũ thiết lập quy chuẩn vận hành và kiểm tra độc lập</w:t>
-      </w:r>
-    </w:p>
-    <w:p>
-      <w:pPr>
-        <w:numPr>
-          <w:ilvl w:val="1"/>
-          <w:numId w:val="2"/>
-        </w:numPr>
-        <w:spacing w:after="0" w:lineRule="auto"/>
-        <w:ind w:left="2160" w:hanging="360"/>
-        <w:rPr>
-          <w:rFonts w:ascii="Times New Roman" w:cs="Times New Roman" w:eastAsia="Times New Roman" w:hAnsi="Times New Roman"/>
-          <w:sz w:val="26"/>
-          <w:szCs w:val="26"/>
-        </w:rPr>
-      </w:pPr>
-      <w:r>
-        <w:rPr>
-          <w:rFonts w:ascii="Times New Roman" w:cs="Times New Roman" w:eastAsia="Times New Roman" w:hAnsi="Times New Roman"/>
-          <w:sz w:val="26"/>
-          <w:szCs w:val="26"/>
-          <w:rtl w:val="0"/>
-        </w:rPr>
-        <w:t xml:space="preserve">Dược sĩ: người trực tiếp bán thuốc và bảo quản thuốc tại của hàng</w:t>
-      </w:r>
-    </w:p>
-    <w:p>
-      <w:pPr>
-        <w:numPr>
-          <w:ilvl w:val="1"/>
-          <w:numId w:val="2"/>
-        </w:numPr>
-        <w:spacing w:after="0" w:lineRule="auto"/>
-        <w:ind w:left="2160" w:hanging="360"/>
-        <w:rPr>
-          <w:rFonts w:ascii="Times New Roman" w:cs="Times New Roman" w:eastAsia="Times New Roman" w:hAnsi="Times New Roman"/>
-          <w:sz w:val="26"/>
-          <w:szCs w:val="26"/>
-        </w:rPr>
-      </w:pPr>
-      <w:r>
-        <w:rPr>
-          <w:rFonts w:ascii="Times New Roman" w:cs="Times New Roman" w:eastAsia="Times New Roman" w:hAnsi="Times New Roman"/>
-          <w:sz w:val="26"/>
-          <w:szCs w:val="26"/>
-          <w:rtl w:val="0"/>
-        </w:rPr>
-        <w:t xml:space="preserve">Phòng chăm sóc khách hàng: tiếp nhận thông tin khiếu nại của người dùng</w:t>
-      </w:r>
-    </w:p>
-    <w:p>
-      <w:pPr>
-        <w:numPr>
-          <w:ilvl w:val="1"/>
-          <w:numId w:val="2"/>
-        </w:numPr>
-        <w:spacing w:after="0" w:lineRule="auto"/>
-        <w:ind w:left="2160" w:hanging="360"/>
-        <w:rPr>
-          <w:rFonts w:ascii="Times New Roman" w:cs="Times New Roman" w:eastAsia="Times New Roman" w:hAnsi="Times New Roman"/>
-          <w:sz w:val="26"/>
-          <w:szCs w:val="26"/>
-        </w:rPr>
-      </w:pPr>
-      <w:r>
-        <w:rPr>
-          <w:rFonts w:ascii="Times New Roman" w:cs="Times New Roman" w:eastAsia="Times New Roman" w:hAnsi="Times New Roman"/>
-          <w:sz w:val="26"/>
-          <w:szCs w:val="26"/>
-          <w:rtl w:val="0"/>
-        </w:rPr>
-        <w:t xml:space="preserve">Cơ quan quản lý nhà nước: sở y tế và cơ quan quản lý thị trường có trách nhiệm thanh tra, kiểm tra xử lý vi phạm của nhà thuốc nếu có</w:t>
-      </w:r>
-    </w:p>
-    <w:p>
-      <w:pPr>
-        <w:numPr>
-          <w:ilvl w:val="0"/>
-          <w:numId w:val="5"/>
-        </w:numPr>
-        <w:spacing w:after="0" w:lineRule="auto"/>
-        <w:ind w:left="1440" w:hanging="360"/>
-        <w:rPr>
-          <w:rFonts w:ascii="Times New Roman" w:cs="Times New Roman" w:eastAsia="Times New Roman" w:hAnsi="Times New Roman"/>
-          <w:b w:val="1"/>
-          <w:bCs w:val="1"/>
-          <w:sz w:val="26"/>
-          <w:szCs w:val="26"/>
-        </w:rPr>
-      </w:pPr>
-      <w:r>
-        <w:rPr>
-          <w:rFonts w:ascii="Times New Roman" w:cs="Times New Roman" w:eastAsia="Times New Roman" w:hAnsi="Times New Roman"/>
-          <w:b w:val="1"/>
-          <w:bCs w:val="1"/>
-          <w:sz w:val="26"/>
-          <w:szCs w:val="26"/>
-          <w:rtl w:val="0"/>
-        </w:rPr>
-        <w:t xml:space="preserve">Khách hàng của quy trình này</w:t>
-      </w:r>
-    </w:p>
-    <w:p>
-      <w:pPr>
-        <w:numPr>
-          <w:ilvl w:val="1"/>
-          <w:numId w:val="2"/>
-        </w:numPr>
-        <w:spacing w:after="0" w:lineRule="auto"/>
-        <w:ind w:left="2160" w:hanging="360"/>
-        <w:rPr>
-          <w:sz w:val="26"/>
-          <w:szCs w:val="26"/>
-        </w:rPr>
-      </w:pPr>
-      <w:r>
-        <w:rPr>
-          <w:rFonts w:ascii="Times New Roman" w:cs="Times New Roman" w:eastAsia="Times New Roman" w:hAnsi="Times New Roman"/>
-          <w:sz w:val="26"/>
-          <w:szCs w:val="26"/>
-          <w:rtl w:val="0"/>
-        </w:rPr>
-        <w:t xml:space="preserve">Khách hàng bên ngoài: người tiêu dùng chính là khách hàng cho quy trình này vì nó giúp người tiêu dùng mua được sản phẩm tốt nhất, không bị lỗi hoặc hết hạn</w:t>
-      </w:r>
-    </w:p>
-    <w:p>
-      <w:pPr>
-        <w:numPr>
-          <w:ilvl w:val="1"/>
-          <w:numId w:val="2"/>
-        </w:numPr>
-        <w:spacing w:after="0" w:lineRule="auto"/>
-        <w:ind w:left="2160" w:hanging="360"/>
-        <w:rPr>
-          <w:rFonts w:ascii="Times New Roman" w:cs="Times New Roman" w:eastAsia="Times New Roman" w:hAnsi="Times New Roman"/>
-          <w:sz w:val="26"/>
-          <w:szCs w:val="26"/>
-        </w:rPr>
-      </w:pPr>
-      <w:r>
-        <w:rPr>
-          <w:rFonts w:ascii="Times New Roman" w:cs="Times New Roman" w:eastAsia="Times New Roman" w:hAnsi="Times New Roman"/>
-          <w:sz w:val="26"/>
-          <w:szCs w:val="26"/>
-          <w:rtl w:val="0"/>
-        </w:rPr>
-        <w:t xml:space="preserve">Khách hàng nội bộ: ban giám đốc công ty (quy trình giúp bảo vệ uy tín thương hiệu và tránh pháp lý liên quan)</w:t>
-      </w:r>
-    </w:p>
-    <w:p>
-      <w:pPr>
-        <w:numPr>
-          <w:ilvl w:val="0"/>
-          <w:numId w:val="5"/>
-        </w:numPr>
-        <w:spacing w:after="0" w:lineRule="auto"/>
-        <w:ind w:left="1440" w:hanging="360"/>
-        <w:rPr>
-          <w:rFonts w:ascii="Times New Roman" w:cs="Times New Roman" w:eastAsia="Times New Roman" w:hAnsi="Times New Roman"/>
-          <w:b w:val="1"/>
-          <w:bCs w:val="1"/>
-          <w:sz w:val="26"/>
-          <w:szCs w:val="26"/>
-        </w:rPr>
-      </w:pPr>
-      <w:r>
-        <w:rPr>
-          <w:rFonts w:ascii="Times New Roman" w:cs="Times New Roman" w:eastAsia="Times New Roman" w:hAnsi="Times New Roman"/>
-          <w:b w:val="1"/>
-          <w:bCs w:val="1"/>
-          <w:sz w:val="26"/>
-          <w:szCs w:val="26"/>
-          <w:rtl w:val="0"/>
-        </w:rPr>
-        <w:t xml:space="preserve">Những khả năng kết quả của quy trình</w:t>
-      </w:r>
-    </w:p>
-    <w:p>
-      <w:pPr>
-        <w:numPr>
-          <w:ilvl w:val="1"/>
-          <w:numId w:val="2"/>
-        </w:numPr>
-        <w:spacing w:after="0" w:lineRule="auto"/>
-        <w:ind w:left="2160" w:hanging="360"/>
-        <w:rPr>
-          <w:sz w:val="26"/>
-          <w:szCs w:val="26"/>
-        </w:rPr>
-      </w:pPr>
-      <w:r>
-        <w:rPr>
-          <w:rFonts w:ascii="Times New Roman" w:cs="Times New Roman" w:eastAsia="Times New Roman" w:hAnsi="Times New Roman"/>
-          <w:sz w:val="26"/>
-          <w:szCs w:val="26"/>
-          <w:rtl w:val="0"/>
-        </w:rPr>
-        <w:t xml:space="preserve">Kết quả tích cực: Ngăn chặn kịp thời thuốc kém chất lượng ra thị trường; hệ thống đạt 100% chuẩn quy định trong các kỳ thanh tra, sự cố được xử lý nhanh gọn mà không ảnh hưởng đến truyền thông.</w:t>
-      </w:r>
-    </w:p>
-    <w:p>
-      <w:pPr>
-        <w:numPr>
-          <w:ilvl w:val="1"/>
-          <w:numId w:val="2"/>
-        </w:numPr>
-        <w:spacing w:after="0" w:lineRule="auto"/>
-        <w:ind w:left="2160" w:hanging="360"/>
-        <w:rPr>
-          <w:rFonts w:ascii="Times New Roman" w:cs="Times New Roman" w:eastAsia="Times New Roman" w:hAnsi="Times New Roman"/>
-          <w:sz w:val="26"/>
-          <w:szCs w:val="26"/>
-        </w:rPr>
-      </w:pPr>
-      <w:r>
-        <w:rPr>
-          <w:rFonts w:ascii="Times New Roman" w:cs="Times New Roman" w:eastAsia="Times New Roman" w:hAnsi="Times New Roman"/>
-          <w:sz w:val="26"/>
-          <w:szCs w:val="26"/>
-          <w:rtl w:val="0"/>
-        </w:rPr>
-        <w:t xml:space="preserve">Kết quả tiêu cực:</w:t>
-      </w:r>
-    </w:p>
-    <w:p>
-      <w:pPr>
-        <w:numPr>
-          <w:ilvl w:val="2"/>
-          <w:numId w:val="2"/>
-        </w:numPr>
-        <w:spacing w:after="0" w:lineRule="auto"/>
-        <w:ind w:left="2880" w:hanging="360"/>
-        <w:rPr>
-          <w:rFonts w:ascii="Times New Roman" w:cs="Times New Roman" w:eastAsia="Times New Roman" w:hAnsi="Times New Roman"/>
-          <w:b w:val="1"/>
-          <w:bCs w:val="1"/>
-          <w:sz w:val="26"/>
-          <w:szCs w:val="26"/>
-        </w:rPr>
-      </w:pPr>
-      <w:r>
-        <w:rPr>
-          <w:rFonts w:ascii="Times New Roman" w:cs="Times New Roman" w:eastAsia="Times New Roman" w:hAnsi="Times New Roman"/>
-          <w:sz w:val="26"/>
-          <w:szCs w:val="26"/>
-          <w:rtl w:val="0"/>
-        </w:rPr>
-        <w:t xml:space="preserve">Thuốc lỗi hoặc hết hạn vô tình bán cho khách hàng dẫn tới khủng hoảng truyền thông</w:t>
-      </w:r>
-    </w:p>
-    <w:p>
-      <w:pPr>
-        <w:numPr>
-          <w:ilvl w:val="2"/>
-          <w:numId w:val="2"/>
-        </w:numPr>
-        <w:spacing w:after="0" w:lineRule="auto"/>
-        <w:ind w:left="2880" w:hanging="360"/>
-        <w:rPr>
-          <w:rFonts w:ascii="Times New Roman" w:cs="Times New Roman" w:eastAsia="Times New Roman" w:hAnsi="Times New Roman"/>
-          <w:sz w:val="26"/>
-          <w:szCs w:val="26"/>
+          <w:sz w:val="26"/>
+          <w:szCs w:val="26"/>
+          <w:u w:val="none"/>
         </w:rPr>
       </w:pPr>
       <w:r>
@@ -2902,6 +2991,19 @@
         </w:rPr>
         <w:t xml:space="preserve">Công ty chịu thiệt hại tài chính lớn do phải tiêu hủy một lượng hàng hóa do bảo quản sai cách</w:t>
       </w:r>
+      <w:r>
+        <w:rPr>
+          <w:rtl w:val="0"/>
+        </w:rPr>
+      </w:r>
+    </w:p>
+    <w:p>
+      <w:pPr>
+        <w:rPr>
+          <w:b w:val="1"/>
+          <w:bCs w:val="1"/>
+        </w:rPr>
+      </w:pPr>
       <w:r>
         <w:rPr>
           <w:rtl w:val="0"/>
@@ -2922,118 +3024,118 @@
   <w:abstractNum w:abstractNumId="1">
     <w:lvl w:ilvl="0">
       <w:start w:val="1"/>
-      <w:numFmt w:val="decimal"/>
-      <w:lvlText w:val="%1."/>
-      <w:lvlJc w:val="right"/>
-      <w:pPr>
-        <w:ind w:left="720" w:hanging="360"/>
-      </w:pPr>
-      <w:rPr>
-        <w:rFonts w:ascii="Aptos" w:cs="Aptos" w:eastAsia="Aptos" w:hAnsi="Aptos"/>
+      <w:numFmt w:val="bullet"/>
+      <w:lvlText w:val="❖"/>
+      <w:lvlJc w:val="left"/>
+      <w:pPr>
+        <w:ind w:left="1440" w:hanging="360"/>
+      </w:pPr>
+      <w:rPr>
+        <w:u w:val="none"/>
       </w:rPr>
     </w:lvl>
     <w:lvl w:ilvl="1">
       <w:start w:val="1"/>
-      <w:numFmt w:val="decimal"/>
-      <w:lvlText w:val="%1.%2."/>
-      <w:lvlJc w:val="right"/>
-      <w:pPr>
-        <w:ind w:left="1440" w:hanging="360"/>
-      </w:pPr>
-      <w:rPr>
-        <w:rFonts w:ascii="Courier New" w:cs="Courier New" w:eastAsia="Courier New" w:hAnsi="Courier New"/>
+      <w:numFmt w:val="bullet"/>
+      <w:lvlText w:val="➢"/>
+      <w:lvlJc w:val="left"/>
+      <w:pPr>
+        <w:ind w:left="2160" w:hanging="360"/>
+      </w:pPr>
+      <w:rPr>
+        <w:u w:val="none"/>
       </w:rPr>
     </w:lvl>
     <w:lvl w:ilvl="2">
       <w:start w:val="1"/>
-      <w:numFmt w:val="decimal"/>
-      <w:lvlText w:val="%1.%2.%3."/>
-      <w:lvlJc w:val="right"/>
-      <w:pPr>
-        <w:ind w:left="2160" w:hanging="360"/>
-      </w:pPr>
-      <w:rPr>
-        <w:rFonts w:ascii="Noto Sans Symbols" w:cs="Noto Sans Symbols" w:eastAsia="Noto Sans Symbols" w:hAnsi="Noto Sans Symbols"/>
+      <w:numFmt w:val="bullet"/>
+      <w:lvlText w:val="■"/>
+      <w:lvlJc w:val="left"/>
+      <w:pPr>
+        <w:ind w:left="2880" w:hanging="360"/>
+      </w:pPr>
+      <w:rPr>
+        <w:u w:val="none"/>
       </w:rPr>
     </w:lvl>
     <w:lvl w:ilvl="3">
       <w:start w:val="1"/>
-      <w:numFmt w:val="decimal"/>
-      <w:lvlText w:val="%1.%2.%3.%4."/>
-      <w:lvlJc w:val="right"/>
-      <w:pPr>
-        <w:ind w:left="2880" w:hanging="360"/>
-      </w:pPr>
-      <w:rPr>
-        <w:rFonts w:ascii="Noto Sans Symbols" w:cs="Noto Sans Symbols" w:eastAsia="Noto Sans Symbols" w:hAnsi="Noto Sans Symbols"/>
+      <w:numFmt w:val="bullet"/>
+      <w:lvlText w:val="●"/>
+      <w:lvlJc w:val="left"/>
+      <w:pPr>
+        <w:ind w:left="3600" w:hanging="360"/>
+      </w:pPr>
+      <w:rPr>
+        <w:u w:val="none"/>
       </w:rPr>
     </w:lvl>
     <w:lvl w:ilvl="4">
       <w:start w:val="1"/>
-      <w:numFmt w:val="decimal"/>
-      <w:lvlText w:val="%1.%2.%3.%4.%5."/>
-      <w:lvlJc w:val="right"/>
-      <w:pPr>
-        <w:ind w:left="3600" w:hanging="360"/>
-      </w:pPr>
-      <w:rPr>
-        <w:rFonts w:ascii="Courier New" w:cs="Courier New" w:eastAsia="Courier New" w:hAnsi="Courier New"/>
+      <w:numFmt w:val="bullet"/>
+      <w:lvlText w:val="◆"/>
+      <w:lvlJc w:val="left"/>
+      <w:pPr>
+        <w:ind w:left="4320" w:hanging="360"/>
+      </w:pPr>
+      <w:rPr>
+        <w:u w:val="none"/>
       </w:rPr>
     </w:lvl>
     <w:lvl w:ilvl="5">
       <w:start w:val="1"/>
-      <w:numFmt w:val="decimal"/>
-      <w:lvlText w:val="%1.%2.%3.%4.%5.%6."/>
-      <w:lvlJc w:val="right"/>
-      <w:pPr>
-        <w:ind w:left="4320" w:hanging="360"/>
-      </w:pPr>
-      <w:rPr>
-        <w:rFonts w:ascii="Noto Sans Symbols" w:cs="Noto Sans Symbols" w:eastAsia="Noto Sans Symbols" w:hAnsi="Noto Sans Symbols"/>
+      <w:numFmt w:val="bullet"/>
+      <w:lvlText w:val="➢"/>
+      <w:lvlJc w:val="left"/>
+      <w:pPr>
+        <w:ind w:left="5040" w:hanging="360"/>
+      </w:pPr>
+      <w:rPr>
+        <w:u w:val="none"/>
       </w:rPr>
     </w:lvl>
     <w:lvl w:ilvl="6">
       <w:start w:val="1"/>
-      <w:numFmt w:val="decimal"/>
-      <w:lvlText w:val="%1.%2.%3.%4.%5.%6.%7."/>
-      <w:lvlJc w:val="right"/>
-      <w:pPr>
-        <w:ind w:left="5040" w:hanging="360"/>
-      </w:pPr>
-      <w:rPr>
-        <w:rFonts w:ascii="Noto Sans Symbols" w:cs="Noto Sans Symbols" w:eastAsia="Noto Sans Symbols" w:hAnsi="Noto Sans Symbols"/>
+      <w:numFmt w:val="bullet"/>
+      <w:lvlText w:val="■"/>
+      <w:lvlJc w:val="left"/>
+      <w:pPr>
+        <w:ind w:left="5760" w:hanging="360"/>
+      </w:pPr>
+      <w:rPr>
+        <w:u w:val="none"/>
       </w:rPr>
     </w:lvl>
     <w:lvl w:ilvl="7">
       <w:start w:val="1"/>
-      <w:numFmt w:val="decimal"/>
-      <w:lvlText w:val="%1.%2.%3.%4.%5.%6.%7.%8."/>
-      <w:lvlJc w:val="right"/>
-      <w:pPr>
-        <w:ind w:left="5760" w:hanging="360"/>
-      </w:pPr>
-      <w:rPr>
-        <w:rFonts w:ascii="Courier New" w:cs="Courier New" w:eastAsia="Courier New" w:hAnsi="Courier New"/>
+      <w:numFmt w:val="bullet"/>
+      <w:lvlText w:val="●"/>
+      <w:lvlJc w:val="left"/>
+      <w:pPr>
+        <w:ind w:left="6480" w:hanging="360"/>
+      </w:pPr>
+      <w:rPr>
+        <w:u w:val="none"/>
       </w:rPr>
     </w:lvl>
     <w:lvl w:ilvl="8">
       <w:start w:val="1"/>
-      <w:numFmt w:val="decimal"/>
-      <w:lvlText w:val="%1.%2.%3.%4.%5.%6.%7.%8.%9."/>
-      <w:lvlJc w:val="right"/>
-      <w:pPr>
-        <w:ind w:left="6480" w:hanging="360"/>
-      </w:pPr>
-      <w:rPr>
-        <w:rFonts w:ascii="Noto Sans Symbols" w:cs="Noto Sans Symbols" w:eastAsia="Noto Sans Symbols" w:hAnsi="Noto Sans Symbols"/>
+      <w:numFmt w:val="bullet"/>
+      <w:lvlText w:val="◆"/>
+      <w:lvlJc w:val="left"/>
+      <w:pPr>
+        <w:ind w:left="7200" w:hanging="360"/>
+      </w:pPr>
+      <w:rPr>
+        <w:u w:val="none"/>
       </w:rPr>
     </w:lvl>
   </w:abstractNum>
   <w:abstractNum w:abstractNumId="2">
     <w:lvl w:ilvl="0">
       <w:start w:val="1"/>
-      <w:numFmt w:val="bullet"/>
-      <w:lvlText w:val="❖"/>
+      <w:numFmt w:val="decimal"/>
+      <w:lvlText w:val="%1."/>
       <w:lvlJc w:val="left"/>
       <w:pPr>
         <w:ind w:left="720" w:hanging="360"/>
@@ -3044,11 +3146,11 @@
     </w:lvl>
     <w:lvl w:ilvl="1">
       <w:start w:val="1"/>
-      <w:numFmt w:val="bullet"/>
-      <w:lvlText w:val="➢"/>
-      <w:lvlJc w:val="left"/>
-      <w:pPr>
-        <w:ind w:left="1440" w:hanging="360"/>
+      <w:numFmt w:val="decimal"/>
+      <w:lvlText w:val="%1.%2"/>
+      <w:lvlJc w:val="left"/>
+      <w:pPr>
+        <w:ind w:left="1092" w:hanging="372"/>
       </w:pPr>
       <w:rPr>
         <w:u w:val="none"/>
@@ -3056,11 +3158,11 @@
     </w:lvl>
     <w:lvl w:ilvl="2">
       <w:start w:val="1"/>
-      <w:numFmt w:val="bullet"/>
-      <w:lvlText w:val="■"/>
-      <w:lvlJc w:val="left"/>
-      <w:pPr>
-        <w:ind w:left="2160" w:hanging="360"/>
+      <w:numFmt w:val="decimal"/>
+      <w:lvlText w:val="%1.%2.%3"/>
+      <w:lvlJc w:val="left"/>
+      <w:pPr>
+        <w:ind w:left="1800" w:hanging="720"/>
       </w:pPr>
       <w:rPr>
         <w:u w:val="none"/>
@@ -3068,11 +3170,11 @@
     </w:lvl>
     <w:lvl w:ilvl="3">
       <w:start w:val="1"/>
-      <w:numFmt w:val="bullet"/>
-      <w:lvlText w:val="●"/>
-      <w:lvlJc w:val="left"/>
-      <w:pPr>
-        <w:ind w:left="2880" w:hanging="360"/>
+      <w:numFmt w:val="decimal"/>
+      <w:lvlText w:val="%1.%2.%3.%4"/>
+      <w:lvlJc w:val="left"/>
+      <w:pPr>
+        <w:ind w:left="2520" w:hanging="1080"/>
       </w:pPr>
       <w:rPr>
         <w:u w:val="none"/>
@@ -3080,11 +3182,11 @@
     </w:lvl>
     <w:lvl w:ilvl="4">
       <w:start w:val="1"/>
-      <w:numFmt w:val="bullet"/>
-      <w:lvlText w:val="◆"/>
-      <w:lvlJc w:val="left"/>
-      <w:pPr>
-        <w:ind w:left="3600" w:hanging="360"/>
+      <w:numFmt w:val="decimal"/>
+      <w:lvlText w:val="%1.%2.%3.%4.%5"/>
+      <w:lvlJc w:val="left"/>
+      <w:pPr>
+        <w:ind w:left="2880" w:hanging="1080"/>
       </w:pPr>
       <w:rPr>
         <w:u w:val="none"/>
@@ -3092,11 +3194,11 @@
     </w:lvl>
     <w:lvl w:ilvl="5">
       <w:start w:val="1"/>
-      <w:numFmt w:val="bullet"/>
-      <w:lvlText w:val="➢"/>
-      <w:lvlJc w:val="left"/>
-      <w:pPr>
-        <w:ind w:left="4320" w:hanging="360"/>
+      <w:numFmt w:val="decimal"/>
+      <w:lvlText w:val="%1.%2.%3.%4.%5.%6"/>
+      <w:lvlJc w:val="left"/>
+      <w:pPr>
+        <w:ind w:left="3600" w:hanging="1440"/>
       </w:pPr>
       <w:rPr>
         <w:u w:val="none"/>
@@ -3104,11 +3206,11 @@
     </w:lvl>
     <w:lvl w:ilvl="6">
       <w:start w:val="1"/>
-      <w:numFmt w:val="bullet"/>
-      <w:lvlText w:val="■"/>
-      <w:lvlJc w:val="left"/>
-      <w:pPr>
-        <w:ind w:left="5040" w:hanging="360"/>
+      <w:numFmt w:val="decimal"/>
+      <w:lvlText w:val="%1.%2.%3.%4.%5.%6.%7"/>
+      <w:lvlJc w:val="left"/>
+      <w:pPr>
+        <w:ind w:left="3960" w:hanging="1440"/>
       </w:pPr>
       <w:rPr>
         <w:u w:val="none"/>
@@ -3116,11 +3218,11 @@
     </w:lvl>
     <w:lvl w:ilvl="7">
       <w:start w:val="1"/>
-      <w:numFmt w:val="bullet"/>
-      <w:lvlText w:val="●"/>
-      <w:lvlJc w:val="left"/>
-      <w:pPr>
-        <w:ind w:left="5760" w:hanging="360"/>
+      <w:numFmt w:val="decimal"/>
+      <w:lvlText w:val="%1.%2.%3.%4.%5.%6.%7.%8"/>
+      <w:lvlJc w:val="left"/>
+      <w:pPr>
+        <w:ind w:left="4680" w:hanging="1800"/>
       </w:pPr>
       <w:rPr>
         <w:u w:val="none"/>
@@ -3128,11 +3230,11 @@
     </w:lvl>
     <w:lvl w:ilvl="8">
       <w:start w:val="1"/>
-      <w:numFmt w:val="bullet"/>
-      <w:lvlText w:val="◆"/>
-      <w:lvlJc w:val="left"/>
-      <w:pPr>
-        <w:ind w:left="6480" w:hanging="360"/>
+      <w:numFmt w:val="decimal"/>
+      <w:lvlText w:val="%1.%2.%3.%4.%5.%6.%7.%8.%9"/>
+      <w:lvlJc w:val="left"/>
+      <w:pPr>
+        <w:ind w:left="5040" w:hanging="1800"/>
       </w:pPr>
       <w:rPr>
         <w:u w:val="none"/>
@@ -3142,110 +3244,110 @@
   <w:abstractNum w:abstractNumId="3">
     <w:lvl w:ilvl="0">
       <w:start w:val="1"/>
-      <w:numFmt w:val="decimal"/>
-      <w:lvlText w:val="%1."/>
+      <w:numFmt w:val="bullet"/>
+      <w:lvlText w:val="❖"/>
       <w:lvlJc w:val="left"/>
       <w:pPr>
         <w:ind w:left="720" w:hanging="360"/>
       </w:pPr>
       <w:rPr>
-        <w:u w:val="none"/>
+        <w:rFonts w:ascii="Aptos" w:cs="Aptos" w:eastAsia="Aptos" w:hAnsi="Aptos"/>
       </w:rPr>
     </w:lvl>
     <w:lvl w:ilvl="1">
       <w:start w:val="1"/>
-      <w:numFmt w:val="decimal"/>
-      <w:lvlText w:val="%1.%2"/>
-      <w:lvlJc w:val="left"/>
-      <w:pPr>
-        <w:ind w:left="1092" w:hanging="372"/>
-      </w:pPr>
-      <w:rPr>
-        <w:u w:val="none"/>
+      <w:numFmt w:val="bullet"/>
+      <w:lvlText w:val="➢"/>
+      <w:lvlJc w:val="left"/>
+      <w:pPr>
+        <w:ind w:left="1440" w:hanging="360"/>
+      </w:pPr>
+      <w:rPr>
+        <w:rFonts w:ascii="Courier New" w:cs="Courier New" w:eastAsia="Courier New" w:hAnsi="Courier New"/>
       </w:rPr>
     </w:lvl>
     <w:lvl w:ilvl="2">
       <w:start w:val="1"/>
-      <w:numFmt w:val="decimal"/>
-      <w:lvlText w:val="%1.%2.%3"/>
-      <w:lvlJc w:val="left"/>
-      <w:pPr>
-        <w:ind w:left="1800" w:hanging="720"/>
-      </w:pPr>
-      <w:rPr>
-        <w:u w:val="none"/>
+      <w:numFmt w:val="bullet"/>
+      <w:lvlText w:val="■"/>
+      <w:lvlJc w:val="left"/>
+      <w:pPr>
+        <w:ind w:left="2160" w:hanging="360"/>
+      </w:pPr>
+      <w:rPr>
+        <w:rFonts w:ascii="Noto Sans Symbols" w:cs="Noto Sans Symbols" w:eastAsia="Noto Sans Symbols" w:hAnsi="Noto Sans Symbols"/>
       </w:rPr>
     </w:lvl>
     <w:lvl w:ilvl="3">
       <w:start w:val="1"/>
-      <w:numFmt w:val="decimal"/>
-      <w:lvlText w:val="%1.%2.%3.%4"/>
-      <w:lvlJc w:val="left"/>
-      <w:pPr>
-        <w:ind w:left="2520" w:hanging="1080"/>
-      </w:pPr>
-      <w:rPr>
-        <w:u w:val="none"/>
+      <w:numFmt w:val="bullet"/>
+      <w:lvlText w:val="●"/>
+      <w:lvlJc w:val="left"/>
+      <w:pPr>
+        <w:ind w:left="2880" w:hanging="360"/>
+      </w:pPr>
+      <w:rPr>
+        <w:rFonts w:ascii="Noto Sans Symbols" w:cs="Noto Sans Symbols" w:eastAsia="Noto Sans Symbols" w:hAnsi="Noto Sans Symbols"/>
       </w:rPr>
     </w:lvl>
     <w:lvl w:ilvl="4">
       <w:start w:val="1"/>
-      <w:numFmt w:val="decimal"/>
-      <w:lvlText w:val="%1.%2.%3.%4.%5"/>
-      <w:lvlJc w:val="left"/>
-      <w:pPr>
-        <w:ind w:left="2880" w:hanging="1080"/>
-      </w:pPr>
-      <w:rPr>
-        <w:u w:val="none"/>
+      <w:numFmt w:val="bullet"/>
+      <w:lvlText w:val="◆"/>
+      <w:lvlJc w:val="left"/>
+      <w:pPr>
+        <w:ind w:left="3600" w:hanging="360"/>
+      </w:pPr>
+      <w:rPr>
+        <w:rFonts w:ascii="Courier New" w:cs="Courier New" w:eastAsia="Courier New" w:hAnsi="Courier New"/>
       </w:rPr>
     </w:lvl>
     <w:lvl w:ilvl="5">
       <w:start w:val="1"/>
-      <w:numFmt w:val="decimal"/>
-      <w:lvlText w:val="%1.%2.%3.%4.%5.%6"/>
-      <w:lvlJc w:val="left"/>
-      <w:pPr>
-        <w:ind w:left="3600" w:hanging="1440"/>
-      </w:pPr>
-      <w:rPr>
-        <w:u w:val="none"/>
+      <w:numFmt w:val="bullet"/>
+      <w:lvlText w:val="➢"/>
+      <w:lvlJc w:val="left"/>
+      <w:pPr>
+        <w:ind w:left="4320" w:hanging="360"/>
+      </w:pPr>
+      <w:rPr>
+        <w:rFonts w:ascii="Noto Sans Symbols" w:cs="Noto Sans Symbols" w:eastAsia="Noto Sans Symbols" w:hAnsi="Noto Sans Symbols"/>
       </w:rPr>
     </w:lvl>
     <w:lvl w:ilvl="6">
       <w:start w:val="1"/>
-      <w:numFmt w:val="decimal"/>
-      <w:lvlText w:val="%1.%2.%3.%4.%5.%6.%7"/>
-      <w:lvlJc w:val="left"/>
-      <w:pPr>
-        <w:ind w:left="3960" w:hanging="1440"/>
-      </w:pPr>
-      <w:rPr>
-        <w:u w:val="none"/>
+      <w:numFmt w:val="bullet"/>
+      <w:lvlText w:val="■"/>
+      <w:lvlJc w:val="left"/>
+      <w:pPr>
+        <w:ind w:left="5040" w:hanging="360"/>
+      </w:pPr>
+      <w:rPr>
+        <w:rFonts w:ascii="Noto Sans Symbols" w:cs="Noto Sans Symbols" w:eastAsia="Noto Sans Symbols" w:hAnsi="Noto Sans Symbols"/>
       </w:rPr>
     </w:lvl>
     <w:lvl w:ilvl="7">
       <w:start w:val="1"/>
-      <w:numFmt w:val="decimal"/>
-      <w:lvlText w:val="%1.%2.%3.%4.%5.%6.%7.%8"/>
-      <w:lvlJc w:val="left"/>
-      <w:pPr>
-        <w:ind w:left="4680" w:hanging="1800"/>
-      </w:pPr>
-      <w:rPr>
-        <w:u w:val="none"/>
+      <w:numFmt w:val="bullet"/>
+      <w:lvlText w:val="●"/>
+      <w:lvlJc w:val="left"/>
+      <w:pPr>
+        <w:ind w:left="5760" w:hanging="360"/>
+      </w:pPr>
+      <w:rPr>
+        <w:rFonts w:ascii="Courier New" w:cs="Courier New" w:eastAsia="Courier New" w:hAnsi="Courier New"/>
       </w:rPr>
     </w:lvl>
     <w:lvl w:ilvl="8">
       <w:start w:val="1"/>
-      <w:numFmt w:val="decimal"/>
-      <w:lvlText w:val="%1.%2.%3.%4.%5.%6.%7.%8.%9"/>
-      <w:lvlJc w:val="left"/>
-      <w:pPr>
-        <w:ind w:left="5040" w:hanging="1800"/>
-      </w:pPr>
-      <w:rPr>
-        <w:u w:val="none"/>
+      <w:numFmt w:val="bullet"/>
+      <w:lvlText w:val="◆"/>
+      <w:lvlJc w:val="left"/>
+      <w:pPr>
+        <w:ind w:left="6480" w:hanging="360"/>
+      </w:pPr>
+      <w:rPr>
+        <w:rFonts w:ascii="Noto Sans Symbols" w:cs="Noto Sans Symbols" w:eastAsia="Noto Sans Symbols" w:hAnsi="Noto Sans Symbols"/>
       </w:rPr>
     </w:lvl>
   </w:abstractNum>
@@ -3256,7 +3358,7 @@
       <w:lvlText w:val="❖"/>
       <w:lvlJc w:val="left"/>
       <w:pPr>
-        <w:ind w:left="1440" w:hanging="360"/>
+        <w:ind w:left="720" w:hanging="360"/>
       </w:pPr>
       <w:rPr>
         <w:u w:val="none"/>
@@ -3268,7 +3370,7 @@
       <w:lvlText w:val="➢"/>
       <w:lvlJc w:val="left"/>
       <w:pPr>
-        <w:ind w:left="2160" w:hanging="360"/>
+        <w:ind w:left="1440" w:hanging="360"/>
       </w:pPr>
       <w:rPr>
         <w:u w:val="none"/>
@@ -3280,7 +3382,7 @@
       <w:lvlText w:val="■"/>
       <w:lvlJc w:val="left"/>
       <w:pPr>
-        <w:ind w:left="2880" w:hanging="360"/>
+        <w:ind w:left="2160" w:hanging="360"/>
       </w:pPr>
       <w:rPr>
         <w:u w:val="none"/>
@@ -3292,7 +3394,7 @@
       <w:lvlText w:val="●"/>
       <w:lvlJc w:val="left"/>
       <w:pPr>
-        <w:ind w:left="3600" w:hanging="360"/>
+        <w:ind w:left="2880" w:hanging="360"/>
       </w:pPr>
       <w:rPr>
         <w:u w:val="none"/>
@@ -3304,7 +3406,7 @@
       <w:lvlText w:val="◆"/>
       <w:lvlJc w:val="left"/>
       <w:pPr>
-        <w:ind w:left="4320" w:hanging="360"/>
+        <w:ind w:left="3600" w:hanging="360"/>
       </w:pPr>
       <w:rPr>
         <w:u w:val="none"/>
@@ -3316,7 +3418,7 @@
       <w:lvlText w:val="➢"/>
       <w:lvlJc w:val="left"/>
       <w:pPr>
-        <w:ind w:left="5040" w:hanging="360"/>
+        <w:ind w:left="4320" w:hanging="360"/>
       </w:pPr>
       <w:rPr>
         <w:u w:val="none"/>
@@ -3328,7 +3430,7 @@
       <w:lvlText w:val="■"/>
       <w:lvlJc w:val="left"/>
       <w:pPr>
-        <w:ind w:left="5760" w:hanging="360"/>
+        <w:ind w:left="5040" w:hanging="360"/>
       </w:pPr>
       <w:rPr>
         <w:u w:val="none"/>
@@ -3340,7 +3442,7 @@
       <w:lvlText w:val="●"/>
       <w:lvlJc w:val="left"/>
       <w:pPr>
-        <w:ind w:left="6480" w:hanging="360"/>
+        <w:ind w:left="5760" w:hanging="360"/>
       </w:pPr>
       <w:rPr>
         <w:u w:val="none"/>
@@ -3352,7 +3454,7 @@
       <w:lvlText w:val="◆"/>
       <w:lvlJc w:val="left"/>
       <w:pPr>
-        <w:ind w:left="7200" w:hanging="360"/>
+        <w:ind w:left="6480" w:hanging="360"/>
       </w:pPr>
       <w:rPr>
         <w:u w:val="none"/>
@@ -3362,8 +3464,8 @@
   <w:abstractNum w:abstractNumId="5">
     <w:lvl w:ilvl="0">
       <w:start w:val="1"/>
-      <w:numFmt w:val="bullet"/>
-      <w:lvlText w:val="❖"/>
+      <w:numFmt w:val="decimal"/>
+      <w:lvlText w:val="%1."/>
       <w:lvlJc w:val="left"/>
       <w:pPr>
         <w:ind w:left="720" w:hanging="360"/>
@@ -3374,11 +3476,11 @@
     </w:lvl>
     <w:lvl w:ilvl="1">
       <w:start w:val="1"/>
-      <w:numFmt w:val="bullet"/>
-      <w:lvlText w:val="➢"/>
-      <w:lvlJc w:val="left"/>
-      <w:pPr>
-        <w:ind w:left="1440" w:hanging="360"/>
+      <w:numFmt w:val="decimal"/>
+      <w:lvlText w:val="%1.%2"/>
+      <w:lvlJc w:val="left"/>
+      <w:pPr>
+        <w:ind w:left="1092" w:hanging="372"/>
       </w:pPr>
       <w:rPr>
         <w:u w:val="none"/>
@@ -3386,11 +3488,11 @@
     </w:lvl>
     <w:lvl w:ilvl="2">
       <w:start w:val="1"/>
-      <w:numFmt w:val="bullet"/>
-      <w:lvlText w:val="■"/>
-      <w:lvlJc w:val="left"/>
-      <w:pPr>
-        <w:ind w:left="2160" w:hanging="360"/>
+      <w:numFmt w:val="decimal"/>
+      <w:lvlText w:val="%1.%2.%3"/>
+      <w:lvlJc w:val="left"/>
+      <w:pPr>
+        <w:ind w:left="1800" w:hanging="720"/>
       </w:pPr>
       <w:rPr>
         <w:u w:val="none"/>
@@ -3398,11 +3500,11 @@
     </w:lvl>
     <w:lvl w:ilvl="3">
       <w:start w:val="1"/>
-      <w:numFmt w:val="bullet"/>
-      <w:lvlText w:val="●"/>
-      <w:lvlJc w:val="left"/>
-      <w:pPr>
-        <w:ind w:left="2880" w:hanging="360"/>
+      <w:numFmt w:val="decimal"/>
+      <w:lvlText w:val="%1.%2.%3.%4"/>
+      <w:lvlJc w:val="left"/>
+      <w:pPr>
+        <w:ind w:left="2520" w:hanging="1080"/>
       </w:pPr>
       <w:rPr>
         <w:u w:val="none"/>
@@ -3410,11 +3512,11 @@
     </w:lvl>
     <w:lvl w:ilvl="4">
       <w:start w:val="1"/>
-      <w:numFmt w:val="bullet"/>
-      <w:lvlText w:val="◆"/>
-      <w:lvlJc w:val="left"/>
-      <w:pPr>
-        <w:ind w:left="3600" w:hanging="360"/>
+      <w:numFmt w:val="decimal"/>
+      <w:lvlText w:val="%1.%2.%3.%4.%5"/>
+      <w:lvlJc w:val="left"/>
+      <w:pPr>
+        <w:ind w:left="2880" w:hanging="1080"/>
       </w:pPr>
       <w:rPr>
         <w:u w:val="none"/>
@@ -3422,11 +3524,11 @@
     </w:lvl>
     <w:lvl w:ilvl="5">
       <w:start w:val="1"/>
-      <w:numFmt w:val="bullet"/>
-      <w:lvlText w:val="➢"/>
-      <w:lvlJc w:val="left"/>
-      <w:pPr>
-        <w:ind w:left="4320" w:hanging="360"/>
+      <w:numFmt w:val="decimal"/>
+      <w:lvlText w:val="%1.%2.%3.%4.%5.%6"/>
+      <w:lvlJc w:val="left"/>
+      <w:pPr>
+        <w:ind w:left="3600" w:hanging="1440"/>
       </w:pPr>
       <w:rPr>
         <w:u w:val="none"/>
@@ -3434,11 +3536,11 @@
     </w:lvl>
     <w:lvl w:ilvl="6">
       <w:start w:val="1"/>
-      <w:numFmt w:val="bullet"/>
-      <w:lvlText w:val="■"/>
-      <w:lvlJc w:val="left"/>
-      <w:pPr>
-        <w:ind w:left="5040" w:hanging="360"/>
+      <w:numFmt w:val="decimal"/>
+      <w:lvlText w:val="%1.%2.%3.%4.%5.%6.%7"/>
+      <w:lvlJc w:val="left"/>
+      <w:pPr>
+        <w:ind w:left="3960" w:hanging="1440"/>
       </w:pPr>
       <w:rPr>
         <w:u w:val="none"/>
@@ -3446,11 +3548,11 @@
     </w:lvl>
     <w:lvl w:ilvl="7">
       <w:start w:val="1"/>
-      <w:numFmt w:val="bullet"/>
-      <w:lvlText w:val="●"/>
-      <w:lvlJc w:val="left"/>
-      <w:pPr>
-        <w:ind w:left="5760" w:hanging="360"/>
+      <w:numFmt w:val="decimal"/>
+      <w:lvlText w:val="%1.%2.%3.%4.%5.%6.%7.%8"/>
+      <w:lvlJc w:val="left"/>
+      <w:pPr>
+        <w:ind w:left="4680" w:hanging="1800"/>
       </w:pPr>
       <w:rPr>
         <w:u w:val="none"/>
@@ -3458,11 +3560,11 @@
     </w:lvl>
     <w:lvl w:ilvl="8">
       <w:start w:val="1"/>
-      <w:numFmt w:val="bullet"/>
-      <w:lvlText w:val="◆"/>
-      <w:lvlJc w:val="left"/>
-      <w:pPr>
-        <w:ind w:left="6480" w:hanging="360"/>
+      <w:numFmt w:val="decimal"/>
+      <w:lvlText w:val="%1.%2.%3.%4.%5.%6.%7.%8.%9"/>
+      <w:lvlJc w:val="left"/>
+      <w:pPr>
+        <w:ind w:left="5040" w:hanging="1800"/>
       </w:pPr>
       <w:rPr>
         <w:u w:val="none"/>
@@ -3978,7 +4080,7 @@
 
 <file path=customXML/item1.xml><?xml version="1.0" encoding="utf-8"?>
 <go:gDocsCustomXmlDataStorage xmlns:go="http://customooxmlschemas.google.com/" xmlns:r="http://schemas.openxmlformats.org/officeDocument/2006/relationships" uri="GoogleDocsCustomDataVersion2">
-  <go:docsCustomData xmlns:go="http://customooxmlschemas.google.com/" roundtripDataSignature="AMtx7mi5wgf7jSMe2Dj99jqrtJA/BdJCxg==">CgMxLjAaEgoBMBINCgsIB0IHEgVBcmlhbBoSCgExEg0KCwgHQgcSBUFyaWFsMg5oLmd4YW4wMGRnNzZkMzIOaC45bDc4c3RvcTBlenU4AHIhMWdkeVZmNUt4NmhFd0lBM19GenV5MEI4LXU0emhxYTVW</go:docsCustomData>
+  <go:docsCustomData xmlns:go="http://customooxmlschemas.google.com/" roundtripDataSignature="AMtx7miAdcwHxjwrexUdYdCxVso26wznJA==">CgMxLjA4AHIhMVZzOTZsMWtpdjhsYWZISG5Ya1QzcHlDVC1Rc0k1c3lT</go:docsCustomData>
 </go:gDocsCustomXmlDataStorage>
 </file>
 

</xml_diff>